<commit_message>
fix: correct OBA templates (heading numbering, glossary refs, code style)
- template-base.docx: rebuilt from Installation example with proper cover
  page (table + logo), version table, Titre2 numId aligned with Titre1
  for correct hierarchical numbering (1, 1.1, 2, 2.1...), removed orphan
  glossary references
- template-compte-rendu.docx: removed CNPP client logo from header,
  cleaned glossary references, proper placeholder structure
- Both templates now open cleanly with python-docx (no KeyError)

Generated with [Claude Code](https://claude.ai/code)
via [Happy](https://happy.engineering)

Co-Authored-By: Claude <noreply@anthropic.com>
Co-Authored-By: Happy <yesreply@happy.engineering>
</commit_message>
<xml_diff>
--- a/skills/docx/templates/onbehalfai/template-base.docx
+++ b/skills/docx/templates/onbehalfai/template-base.docx
@@ -2,24 +2,801 @@
 <file path=word/document.xml><?xml version="1.0" encoding="utf-8"?>
 <w:document xmlns:wpc="http://schemas.microsoft.com/office/word/2010/wordprocessingCanvas" xmlns:cx="http://schemas.microsoft.com/office/drawing/2014/chartex" xmlns:cx1="http://schemas.microsoft.com/office/drawing/2015/9/8/chartex" xmlns:cx2="http://schemas.microsoft.com/office/drawing/2015/10/21/chartex" xmlns:cx3="http://schemas.microsoft.com/office/drawing/2016/5/9/chartex" xmlns:cx4="http://schemas.microsoft.com/office/drawing/2016/5/10/chartex" xmlns:cx5="http://schemas.microsoft.com/office/drawing/2016/5/11/chartex" xmlns:cx6="http://schemas.microsoft.com/office/drawing/2016/5/12/chartex" xmlns:cx7="http://schemas.microsoft.com/office/drawing/2016/5/13/chartex" xmlns:cx8="http://schemas.microsoft.com/office/drawing/2016/5/14/chartex" xmlns:mc="http://schemas.openxmlformats.org/markup-compatibility/2006" xmlns:aink="http://schemas.microsoft.com/office/drawing/2016/ink" xmlns:am3d="http://schemas.microsoft.com/office/drawing/2017/model3d" xmlns:o="urn:schemas-microsoft-com:office:office" xmlns:oel="http://schemas.microsoft.com/office/2019/extlst" xmlns:r="http://schemas.openxmlformats.org/officeDocument/2006/relationships" xmlns:m="http://schemas.openxmlformats.org/officeDocument/2006/math" xmlns:v="urn:schemas-microsoft-com:vml" xmlns:wp14="http://schemas.microsoft.com/office/word/2010/wordprocessingDrawing" xmlns:wp="http://schemas.openxmlformats.org/drawingml/2006/wordprocessingDrawing" xmlns:w10="urn:schemas-microsoft-com:office:word" xmlns:w="http://schemas.openxmlformats.org/wordprocessingml/2006/main" xmlns:w14="http://schemas.microsoft.com/office/word/2010/wordml" xmlns:w15="http://schemas.microsoft.com/office/word/2012/wordml" xmlns:w16cex="http://schemas.microsoft.com/office/word/2018/wordml/cex" xmlns:w16cid="http://schemas.microsoft.com/office/word/2016/wordml/cid" xmlns:w16="http://schemas.microsoft.com/office/word/2018/wordml" xmlns:w16du="http://schemas.microsoft.com/office/word/2023/wordml/word16du" xmlns:w16sdtdh="http://schemas.microsoft.com/office/word/2020/wordml/sdtdatahash" xmlns:w16sdtfl="http://schemas.microsoft.com/office/word/2024/wordml/sdtformatlock" xmlns:w16se="http://schemas.microsoft.com/office/word/2015/wordml/symex" xmlns:wpg="http://schemas.microsoft.com/office/word/2010/wordprocessingGroup" xmlns:wpi="http://schemas.microsoft.com/office/word/2010/wordprocessingInk" xmlns:wne="http://schemas.microsoft.com/office/word/2006/wordml" xmlns:wps="http://schemas.microsoft.com/office/word/2010/wordprocessingShape" mc:Ignorable="w14 w15 w16se w16cid w16 w16cex w16sdtdh w16sdtfl w16du wp14">
   <w:body>
+    <w:tbl>
+      <w:tblPr>
+        <w:tblStyle w:val="Grilledutableau"/>
+        <w:tblW w:w="0" w:type="auto"/>
+        <w:tblBorders>
+          <w:top w:val="none" w:sz="0" w:space="0" w:color="auto"/>
+          <w:left w:val="none" w:sz="0" w:space="0" w:color="auto"/>
+          <w:bottom w:val="none" w:sz="0" w:space="0" w:color="auto"/>
+          <w:right w:val="none" w:sz="0" w:space="0" w:color="auto"/>
+          <w:insideH w:val="none" w:sz="0" w:space="0" w:color="auto"/>
+          <w:insideV w:val="none" w:sz="0" w:space="0" w:color="auto"/>
+        </w:tblBorders>
+        <w:tblLayout w:type="fixed"/>
+        <w:tblLook w:val="04A0" w:firstRow="1" w:lastRow="0" w:firstColumn="1" w:lastColumn="0" w:noHBand="0" w:noVBand="1"/>
+      </w:tblPr>
+      <w:tblGrid>
+        <w:gridCol w:w="4320"/>
+        <w:gridCol w:w="5040"/>
+      </w:tblGrid>
+      <w:tr>
+        <w:trPr>
+          <w:trHeight w:val="2970"/>
+        </w:trPr>
+        <w:tc>
+          <w:tcPr>
+            <w:tcW w:w="4320" w:type="dxa"/>
+            <w:vAlign w:val="center"/>
+          </w:tcPr>
+          <w:p>
+            <w:pPr>
+              <w:rPr>
+                <w:sz w:val="80"/>
+                <w:lang w:val="fr-FR"/>
+              </w:rPr>
+            </w:pPr>
+            <w:sdt>
+              <w:sdtPr>
+                <w:rPr>
+                  <w:color w:val="2F73B3" w:themeColor="accent3" w:themeShade="BF"/>
+                  <w:sz w:val="72"/>
+                  <w:szCs w:val="18"/>
+                </w:rPr>
+                <w:id w:val="-1771764096"/>
+                <w:placeholder>
+                  <w:docPart w:val="C70B363C448C4F0582159224513FC4C9"/>
+                </w:placeholder>
+                <w15:appearance w15:val="hidden"/>
+              </w:sdtPr>
+              <w:sdtEndPr/>
+              <w:sdtContent>
+                <w:r>
+                  <w:rPr>
+                    <w:color w:val="2F73B3" w:themeColor="accent3" w:themeShade="BF"/>
+                    <w:sz w:val="44"/>
+                    <w:szCs w:val="10"/>
+                    <w:lang w:val="fr-FR"/>
+                  </w:rPr>
+                  <w:t xml:space="preserve">[TITRE DU DOCUMENT]</w:t>
+                </w:r>
+                <w:r>
+                  <w:rPr>
+                    <w:color w:val="2F73B3" w:themeColor="accent3" w:themeShade="BF"/>
+                    <w:sz w:val="44"/>
+                    <w:szCs w:val="10"/>
+                    <w:lang w:val="fr-FR"/>
+                  </w:rPr>
+                  <w:t xml:space="preserve"/>
+                </w:r>
+              </w:sdtContent>
+            </w:sdt>
+          </w:p>
+        </w:tc>
+        <w:tc>
+          <w:tcPr>
+            <w:tcW w:w="5040" w:type="dxa"/>
+            <w:vMerge w:val="restart"/>
+          </w:tcPr>
+          <w:p>
+            <w:pPr>
+              <w:jc w:val="right"/>
+              <w:rPr>
+                <w:lang w:val="fr-FR"/>
+              </w:rPr>
+            </w:pPr>
+          </w:p>
+          <w:p>
+            <w:pPr>
+              <w:jc w:val="right"/>
+              <w:rPr>
+                <w:lang w:val="fr-FR"/>
+              </w:rPr>
+            </w:pPr>
+          </w:p>
+          <w:p>
+            <w:pPr>
+              <w:jc w:val="right"/>
+            </w:pPr>
+            <w:r>
+              <w:rPr>
+                <w:noProof/>
+              </w:rPr>
+              <w:drawing>
+                <wp:inline distT="0" distB="0" distL="0" distR="0" wp14:anchorId="38FD317A" wp14:editId="645FF8C0">
+                  <wp:extent cx="1519673" cy="1488404"/>
+                  <wp:effectExtent l="0" t="0" r="4445" b="0"/>
+                  <wp:docPr id="1966488892" name="Graphic 3"/>
+                  <wp:cNvGraphicFramePr>
+                    <a:graphicFrameLocks xmlns:a="http://schemas.openxmlformats.org/drawingml/2006/main" noChangeAspect="1"/>
+                  </wp:cNvGraphicFramePr>
+                  <a:graphic xmlns:a="http://schemas.openxmlformats.org/drawingml/2006/main">
+                    <a:graphicData uri="http://schemas.openxmlformats.org/drawingml/2006/picture">
+                      <pic:pic xmlns:pic="http://schemas.openxmlformats.org/drawingml/2006/picture">
+                        <pic:nvPicPr>
+                          <pic:cNvPr id="1966488892" name="Graphic 3"/>
+                          <pic:cNvPicPr/>
+                        </pic:nvPicPr>
+                        <pic:blipFill>
+                          <a:blip r:embed="rId11">
+                            <a:extLst>
+                              <a:ext uri="{28A0092B-C50C-407E-A947-70E740481C1C}">
+                                <a14:useLocalDpi xmlns:a14="http://schemas.microsoft.com/office/drawing/2010/main" val="0"/>
+                              </a:ext>
+                              <a:ext uri="{96DAC541-7B7A-43D3-8B79-37D633B846F1}">
+                                <asvg:svgBlip xmlns:asvg="http://schemas.microsoft.com/office/drawing/2016/SVG/main" r:embed="rId12"/>
+                              </a:ext>
+                            </a:extLst>
+                          </a:blip>
+                          <a:stretch>
+                            <a:fillRect/>
+                          </a:stretch>
+                        </pic:blipFill>
+                        <pic:spPr>
+                          <a:xfrm>
+                            <a:off x="0" y="0"/>
+                            <a:ext cx="1525179" cy="1493797"/>
+                          </a:xfrm>
+                          <a:prstGeom prst="rect">
+                            <a:avLst/>
+                          </a:prstGeom>
+                        </pic:spPr>
+                      </pic:pic>
+                    </a:graphicData>
+                  </a:graphic>
+                </wp:inline>
+              </w:drawing>
+            </w:r>
+          </w:p>
+        </w:tc>
+      </w:tr>
+      <w:tr>
+        <w:trPr>
+          <w:trHeight w:val="2970"/>
+        </w:trPr>
+        <w:tc>
+          <w:tcPr>
+            <w:tcW w:w="4320" w:type="dxa"/>
+            <w:vAlign w:val="center"/>
+          </w:tcPr>
+          <w:p>
+            <w:pPr>
+              <w:rPr>
+                <w:color w:val="2F73B3" w:themeColor="accent3" w:themeShade="BF"/>
+                <w:sz w:val="72"/>
+                <w:szCs w:val="18"/>
+              </w:rPr>
+            </w:pPr>
+          </w:p>
+        </w:tc>
+        <w:tc>
+          <w:tcPr>
+            <w:tcW w:w="5040" w:type="dxa"/>
+            <w:vMerge/>
+          </w:tcPr>
+          <w:p>
+            <w:pPr>
+              <w:jc w:val="right"/>
+              <w:rPr>
+                <w:noProof/>
+              </w:rPr>
+            </w:pPr>
+          </w:p>
+        </w:tc>
+      </w:tr>
+      <w:tr>
+        <w:tc>
+          <w:tcPr>
+            <w:tcW w:w="4320" w:type="dxa"/>
+            <w:vAlign w:val="center"/>
+          </w:tcPr>
+          <w:p>
+            <w:pPr>
+              <w:rPr>
+                <w:b/>
+                <w:bCs/>
+                <w:i/>
+                <w:iCs/>
+                <w:color w:val="3B68A9"/>
+                <w:sz w:val="52"/>
+                <w:lang w:val="fr-FR"/>
+              </w:rPr>
+            </w:pPr>
+            <w:sdt>
+              <w:sdtPr>
+                <w:rPr>
+                  <w:b/>
+                  <w:bCs/>
+                  <w:i/>
+                  <w:iCs/>
+                  <w:color w:val="223A50" w:themeColor="accent2" w:themeShade="40"/>
+                  <w:sz w:val="72"/>
+                  <w:szCs w:val="24"/>
+                </w:rPr>
+                <w:id w:val="1057902306"/>
+                <w:placeholder>
+                  <w:docPart w:val="A7CC9A5B507E429CA0447E756B30411E"/>
+                </w:placeholder>
+                <w15:appearance w15:val="hidden"/>
+              </w:sdtPr>
+              <w:sdtEndPr>
+                <w:rPr>
+                  <w:caps/>
+                  <w:color w:val="233F70" w:themeColor="accent1" w:themeShade="BF"/>
+                </w:rPr>
+              </w:sdtEndPr>
+              <w:sdtContent>
+                <w:r>
+                  <w:rPr>
+                    <w:b/>
+                    <w:bCs/>
+                    <w:i/>
+                    <w:iCs/>
+                    <w:caps/>
+                    <w:color w:val="233F70" w:themeColor="accent1" w:themeShade="BF"/>
+                    <w:spacing w:val="20"/>
+                    <w:sz w:val="26"/>
+                    <w:szCs w:val="26"/>
+                    <w:lang w:val="fr-FR"/>
+                  </w:rPr>
+                  <w:t xml:space="preserve">[Sous-titre du document]</w:t>
+                </w:r>
+                <w:r>
+                  <w:rPr>
+                    <w:b/>
+                    <w:bCs/>
+                    <w:i/>
+                    <w:iCs/>
+                    <w:caps/>
+                    <w:color w:val="233F70" w:themeColor="accent1" w:themeShade="BF"/>
+                    <w:spacing w:val="20"/>
+                    <w:sz w:val="26"/>
+                    <w:szCs w:val="26"/>
+                    <w:lang w:val="fr-FR"/>
+                  </w:rPr>
+                  <w:t/>
+                </w:r>
+                <w:r>
+                  <w:rPr>
+                    <w:b/>
+                    <w:bCs/>
+                    <w:i/>
+                    <w:iCs/>
+                    <w:caps/>
+                    <w:color w:val="233F70" w:themeColor="accent1" w:themeShade="BF"/>
+                    <w:spacing w:val="20"/>
+                    <w:sz w:val="26"/>
+                    <w:szCs w:val="26"/>
+                    <w:lang w:val="fr-FR"/>
+                  </w:rPr>
+                  <w:t/>
+                </w:r>
+                <w:r>
+                  <w:rPr>
+                    <w:b/>
+                    <w:bCs/>
+                    <w:i/>
+                    <w:iCs/>
+                    <w:caps/>
+                    <w:color w:val="233F70" w:themeColor="accent1" w:themeShade="BF"/>
+                    <w:spacing w:val="20"/>
+                    <w:sz w:val="26"/>
+                    <w:szCs w:val="26"/>
+                    <w:lang w:val="fr-FR"/>
+                  </w:rPr>
+                  <w:t/>
+                </w:r>
+              </w:sdtContent>
+            </w:sdt>
+            <w:r>
+              <w:rPr>
+                <w:b/>
+                <w:bCs/>
+                <w:i/>
+                <w:iCs/>
+                <w:color w:val="233F70" w:themeColor="accent1" w:themeShade="BF"/>
+                <w:sz w:val="72"/>
+                <w:szCs w:val="24"/>
+                <w:lang w:val="fr-FR"/>
+              </w:rPr>
+              <w:t xml:space="preserve"/>
+            </w:r>
+          </w:p>
+        </w:tc>
+        <w:tc>
+          <w:tcPr>
+            <w:tcW w:w="5040" w:type="dxa"/>
+            <w:vMerge/>
+          </w:tcPr>
+          <w:p>
+            <w:pPr>
+              <w:rPr>
+                <w:lang w:val="fr-FR"/>
+              </w:rPr>
+            </w:pPr>
+          </w:p>
+        </w:tc>
+      </w:tr>
+    </w:tbl>
     <w:p>
       <w:pPr>
-        <w:pStyle w:val="Titre1sansnumération"/>
-      </w:pPr>
-      <w:r>
         <w:rPr>
-          <w:b/>
+          <w:lang w:eastAsia="ja-JP"/>
         </w:rPr>
-        <w:t xml:space="preserve">[Titre du document]</w:t>
-      </w:r>
+      </w:pPr>
     </w:p>
+    <w:p>
+      <w:pPr>
+        <w:rPr>
+          <w:lang w:eastAsia="ja-JP"/>
+        </w:rPr>
+      </w:pPr>
+    </w:p>
+    <w:p>
+      <w:pPr>
+        <w:rPr>
+          <w:lang w:eastAsia="ja-JP"/>
+        </w:rPr>
+      </w:pPr>
+    </w:p>
+    <w:p>
+      <w:pPr>
+        <w:rPr>
+          <w:lang w:eastAsia="ja-JP"/>
+        </w:rPr>
+      </w:pPr>
+    </w:p>
+    <w:p>
+      <w:pPr>
+        <w:rPr>
+          <w:lang w:eastAsia="ja-JP"/>
+        </w:rPr>
+      </w:pPr>
+    </w:p>
+    <w:tbl>
+      <w:tblPr>
+        <w:tblStyle w:val="Grilledutableau"/>
+        <w:tblW w:w="9350" w:type="dxa"/>
+        <w:tblBorders>
+          <w:top w:val="none" w:sz="0" w:space="0" w:color="auto"/>
+          <w:left w:val="none" w:sz="0" w:space="0" w:color="auto"/>
+          <w:bottom w:val="none" w:sz="0" w:space="0" w:color="auto"/>
+          <w:right w:val="none" w:sz="0" w:space="0" w:color="auto"/>
+          <w:insideH w:val="none" w:sz="0" w:space="0" w:color="auto"/>
+          <w:insideV w:val="none" w:sz="0" w:space="0" w:color="auto"/>
+        </w:tblBorders>
+        <w:tblLook w:val="04A0" w:firstRow="1" w:lastRow="0" w:firstColumn="1" w:lastColumn="0" w:noHBand="0" w:noVBand="1"/>
+      </w:tblPr>
+      <w:tblGrid>
+        <w:gridCol w:w="9350"/>
+      </w:tblGrid>
+      <w:tr>
+        <w:trPr>
+          <w:trHeight w:val="521"/>
+        </w:trPr>
+        <w:tc>
+          <w:tcPr>
+            <w:tcW w:w="9350" w:type="dxa"/>
+            <w:shd w:val="clear" w:color="auto" w:fill="E0E8F4"/>
+            <w:vAlign w:val="center"/>
+          </w:tcPr>
+          <w:p>
+            <w:pPr>
+              <w:rPr>
+                <w:b/>
+                <w:bCs/>
+              </w:rPr>
+            </w:pPr>
+            <w:r>
+              <w:rPr>
+                <w:b/>
+                <w:bCs/>
+              </w:rPr>
+              <w:t>VERSION</w:t>
+            </w:r>
+          </w:p>
+        </w:tc>
+      </w:tr>
+      <w:tr>
+        <w:trPr>
+          <w:trHeight w:val="1655"/>
+        </w:trPr>
+        <w:tc>
+          <w:tcPr>
+            <w:tcW w:w="9350" w:type="dxa"/>
+          </w:tcPr>
+          <w:p/>
+          <w:tbl>
+            <w:tblPr>
+              <w:tblStyle w:val="Grilledutableau"/>
+              <w:tblW w:w="0" w:type="auto"/>
+              <w:tblBorders>
+                <w:top w:val="single" w:sz="4" w:space="0" w:color="BFBFBF" w:themeColor="background1" w:themeShade="BF"/>
+                <w:left w:val="single" w:sz="4" w:space="0" w:color="BFBFBF" w:themeColor="background1" w:themeShade="BF"/>
+                <w:bottom w:val="single" w:sz="4" w:space="0" w:color="BFBFBF" w:themeColor="background1" w:themeShade="BF"/>
+                <w:right w:val="single" w:sz="4" w:space="0" w:color="BFBFBF" w:themeColor="background1" w:themeShade="BF"/>
+                <w:insideH w:val="single" w:sz="4" w:space="0" w:color="BFBFBF" w:themeColor="background1" w:themeShade="BF"/>
+                <w:insideV w:val="single" w:sz="4" w:space="0" w:color="BFBFBF" w:themeColor="background1" w:themeShade="BF"/>
+              </w:tblBorders>
+              <w:tblCellMar>
+                <w:top w:w="85" w:type="dxa"/>
+                <w:bottom w:w="85" w:type="dxa"/>
+              </w:tblCellMar>
+              <w:tblLook w:val="04A0" w:firstRow="1" w:lastRow="0" w:firstColumn="1" w:lastColumn="0" w:noHBand="0" w:noVBand="1"/>
+            </w:tblPr>
+            <w:tblGrid>
+              <w:gridCol w:w="4139"/>
+              <w:gridCol w:w="1843"/>
+              <w:gridCol w:w="1419"/>
+              <w:gridCol w:w="1723"/>
+            </w:tblGrid>
+            <w:tr>
+              <w:tc>
+                <w:tcPr>
+                  <w:tcW w:w="4139" w:type="dxa"/>
+                </w:tcPr>
+                <w:p>
+                  <w:pPr>
+                    <w:rPr>
+                      <w:rFonts w:ascii="Century Gothic" w:hAnsi="Century Gothic" w:cs="Times New Roman (Body CS)"/>
+                    </w:rPr>
+                  </w:pPr>
+                  <w:sdt>
+                    <w:sdtPr>
+                      <w:id w:val="778299354"/>
+                      <w:placeholder>
+                        <w:docPart w:val="47A831E4F0404083A07A4231A02646D5"/>
+                      </w:placeholder>
+                      <w15:appearance w15:val="hidden"/>
+                    </w:sdtPr>
+                    <w:sdtEndPr/>
+                    <w:sdtContent>
+                      <w:sdt>
+                        <w:sdtPr>
+                          <w:id w:val="-319735071"/>
+                          <w:placeholder>
+                            <w:docPart w:val="87DEF2BFA9DD4DACBE7DBB03DD8AE086"/>
+                          </w:placeholder>
+                          <w15:appearance w15:val="hidden"/>
+                        </w:sdtPr>
+                        <w:sdtEndPr/>
+                        <w:sdtContent>
+                          <w:sdt>
+                            <w:sdtPr>
+                              <w:id w:val="172148857"/>
+                              <w:placeholder>
+                                <w:docPart w:val="07670CCD35E54124A9117FF672887882"/>
+                              </w:placeholder>
+                              <w15:appearance w15:val="hidden"/>
+                            </w:sdtPr>
+                            <w:sdtEndPr/>
+                            <w:sdtContent>
+                              <w:proofErr w:type="spellStart"/>
+                              <w:r>
+                                <w:t>Statut</w:t>
+                              </w:r>
+                              <w:proofErr w:type="spellEnd"/>
+                            </w:sdtContent>
+                          </w:sdt>
+                        </w:sdtContent>
+                      </w:sdt>
+                    </w:sdtContent>
+                  </w:sdt>
+                </w:p>
+              </w:tc>
+              <w:tc>
+                <w:tcPr>
+                  <w:tcW w:w="1843" w:type="dxa"/>
+                </w:tcPr>
+                <w:p>
+                  <w:pPr>
+                    <w:rPr>
+                      <w:rFonts w:ascii="Century Gothic" w:hAnsi="Century Gothic" w:cs="Times New Roman (Body CS)"/>
+                    </w:rPr>
+                  </w:pPr>
+                  <w:sdt>
+                    <w:sdtPr>
+                      <w:id w:val="1010946485"/>
+                      <w:placeholder>
+                        <w:docPart w:val="E7FAC50EEF074F2399CB3C9FBCD7496E"/>
+                      </w:placeholder>
+                      <w15:appearance w15:val="hidden"/>
+                    </w:sdtPr>
+                    <w:sdtEndPr/>
+                    <w:sdtContent>
+                      <w:sdt>
+                        <w:sdtPr>
+                          <w:id w:val="-2126684921"/>
+                          <w:placeholder>
+                            <w:docPart w:val="21BD95EFB8B542F98EA425B445665A39"/>
+                          </w:placeholder>
+                          <w15:appearance w15:val="hidden"/>
+                        </w:sdtPr>
+                        <w:sdtEndPr/>
+                        <w:sdtContent>
+                          <w:sdt>
+                            <w:sdtPr>
+                              <w:id w:val="923526282"/>
+                              <w:placeholder>
+                                <w:docPart w:val="4136D34995434C2A818DA23667B1110B"/>
+                              </w:placeholder>
+                              <w15:appearance w15:val="hidden"/>
+                            </w:sdtPr>
+                            <w:sdtEndPr/>
+                            <w:sdtContent>
+                              <w:r>
+                                <w:t>Auteur</w:t>
+                              </w:r>
+                            </w:sdtContent>
+                          </w:sdt>
+                        </w:sdtContent>
+                      </w:sdt>
+                    </w:sdtContent>
+                  </w:sdt>
+                </w:p>
+              </w:tc>
+              <w:tc>
+                <w:tcPr>
+                  <w:tcW w:w="1419" w:type="dxa"/>
+                </w:tcPr>
+                <w:p>
+                  <w:pPr>
+                    <w:rPr>
+                      <w:rFonts w:ascii="Century Gothic" w:hAnsi="Century Gothic" w:cs="Times New Roman (Body CS)"/>
+                    </w:rPr>
+                  </w:pPr>
+                  <w:sdt>
+                    <w:sdtPr>
+                      <w:id w:val="-1195997186"/>
+                      <w:placeholder>
+                        <w:docPart w:val="7B2B348197FF48D68CA99B90EE255A2F"/>
+                      </w:placeholder>
+                      <w15:appearance w15:val="hidden"/>
+                    </w:sdtPr>
+                    <w:sdtEndPr/>
+                    <w:sdtContent>
+                      <w:sdt>
+                        <w:sdtPr>
+                          <w:id w:val="1870174468"/>
+                          <w:placeholder>
+                            <w:docPart w:val="9612730242FA4A49AE5BE99C2EDC88FE"/>
+                          </w:placeholder>
+                          <w15:appearance w15:val="hidden"/>
+                        </w:sdtPr>
+                        <w:sdtEndPr/>
+                        <w:sdtContent>
+                          <w:sdt>
+                            <w:sdtPr>
+                              <w:id w:val="-1646808695"/>
+                              <w:placeholder>
+                                <w:docPart w:val="D7B1B1AD4EBF46FB90FF54DF4B5BE2D2"/>
+                              </w:placeholder>
+                              <w15:appearance w15:val="hidden"/>
+                            </w:sdtPr>
+                            <w:sdtEndPr/>
+                            <w:sdtContent>
+                              <w:r>
+                                <w:t>Date</w:t>
+                              </w:r>
+                            </w:sdtContent>
+                          </w:sdt>
+                        </w:sdtContent>
+                      </w:sdt>
+                    </w:sdtContent>
+                  </w:sdt>
+                </w:p>
+              </w:tc>
+              <w:tc>
+                <w:tcPr>
+                  <w:tcW w:w="1723" w:type="dxa"/>
+                </w:tcPr>
+                <w:p>
+                  <w:r>
+                    <w:t>Version</w:t>
+                  </w:r>
+                </w:p>
+              </w:tc>
+            </w:tr>
+            <w:tr>
+              <w:tc>
+                <w:tcPr>
+                  <w:tcW w:w="4139" w:type="dxa"/>
+                </w:tcPr>
+                <w:p>
+                  <w:pPr>
+                    <w:rPr>
+                      <w:rFonts w:ascii="Century Gothic" w:hAnsi="Century Gothic" w:cs="Times New Roman (Body CS)"/>
+                      <w:lang w:val="fr-FR"/>
+                    </w:rPr>
+                  </w:pPr>
+                  <w:sdt>
+                    <w:sdtPr>
+                      <w:id w:val="316154579"/>
+                      <w:placeholder>
+                        <w:docPart w:val="814BD51638B94588A861AFA9B84C3069"/>
+                      </w:placeholder>
+                      <w15:appearance w15:val="hidden"/>
+                    </w:sdtPr>
+                    <w:sdtEndPr/>
+                    <w:sdtContent>
+                      <w:sdt>
+                        <w:sdtPr>
+                          <w:id w:val="-220440858"/>
+                          <w:placeholder>
+                            <w:docPart w:val="8857208EDDE94D858E1EA7F0BD0E0340"/>
+                          </w:placeholder>
+                          <w15:appearance w15:val="hidden"/>
+                        </w:sdtPr>
+                        <w:sdtEndPr/>
+                        <w:sdtContent>
+                          <w:sdt>
+                            <w:sdtPr>
+                              <w:id w:val="40405256"/>
+                              <w:placeholder>
+                                <w:docPart w:val="2B8AF544037641078CD3CB73B2B13DCE"/>
+                              </w:placeholder>
+                              <w15:appearance w15:val="hidden"/>
+                            </w:sdtPr>
+                            <w:sdtEndPr/>
+                            <w:sdtContent>
+                              <w:r>
+                                <w:rPr>
+                                  <w:lang w:val="fr-FR"/>
+                                </w:rPr>
+                                <w:t>Création</w:t>
+                              </w:r>
+                              <w:r>
+                                <w:rPr>
+                                  <w:lang w:val="fr-FR"/>
+                                </w:rPr>
+                                <w:t xml:space="preserve"> </w:t>
+                              </w:r>
+                            </w:sdtContent>
+                          </w:sdt>
+                        </w:sdtContent>
+                      </w:sdt>
+                    </w:sdtContent>
+                  </w:sdt>
+                </w:p>
+              </w:tc>
+              <w:tc>
+                <w:tcPr>
+                  <w:tcW w:w="1843" w:type="dxa"/>
+                </w:tcPr>
+                <w:p>
+                  <w:pPr>
+                    <w:rPr>
+                      <w:rFonts w:ascii="Century Gothic" w:hAnsi="Century Gothic" w:cs="Times New Roman (Body CS)"/>
+                    </w:rPr>
+                  </w:pPr>
+                  <w:sdt>
+                    <w:sdtPr>
+                      <w:id w:val="-1194684810"/>
+                      <w:placeholder>
+                        <w:docPart w:val="C8F2D39CB9724F80AE65019B69752C71"/>
+                      </w:placeholder>
+                      <w15:appearance w15:val="hidden"/>
+                    </w:sdtPr>
+                    <w:sdtEndPr/>
+                    <w:sdtContent>
+                      <w:sdt>
+                        <w:sdtPr>
+                          <w:id w:val="-1467267507"/>
+                          <w:placeholder>
+                            <w:docPart w:val="5C53D15E01A94521AA3CE390F90A15F6"/>
+                          </w:placeholder>
+                          <w15:appearance w15:val="hidden"/>
+                        </w:sdtPr>
+                        <w:sdtEndPr/>
+                        <w:sdtContent>
+                          <w:sdt>
+                            <w:sdtPr>
+                              <w:id w:val="1553111688"/>
+                              <w:placeholder>
+                                <w:docPart w:val="825668098004422993DB21EDCD48DD91"/>
+                              </w:placeholder>
+                              <w15:appearance w15:val="hidden"/>
+                            </w:sdtPr>
+                            <w:sdtEndPr/>
+                            <w:sdtContent>
+                              <w:r>
+                                <w:t>[Auteur]</w:t>
+                              </w:r>
+                            </w:sdtContent>
+                          </w:sdt>
+                        </w:sdtContent>
+                      </w:sdt>
+                    </w:sdtContent>
+                  </w:sdt>
+                </w:p>
+              </w:tc>
+              <w:tc>
+                <w:tcPr>
+                  <w:tcW w:w="1419" w:type="dxa"/>
+                </w:tcPr>
+                <w:p>
+                  <w:pPr>
+                    <w:rPr>
+                      <w:rFonts w:ascii="Century Gothic" w:hAnsi="Century Gothic" w:cs="Times New Roman (Body CS)"/>
+                    </w:rPr>
+                  </w:pPr>
+                  <w:sdt>
+                    <w:sdtPr>
+                      <w:id w:val="-148829507"/>
+                      <w:placeholder>
+                        <w:docPart w:val="6B0D314368034FA58339F6C886751F69"/>
+                      </w:placeholder>
+                      <w15:appearance w15:val="hidden"/>
+                    </w:sdtPr>
+                    <w:sdtEndPr/>
+                    <w:sdtContent>
+                      <w:sdt>
+                        <w:sdtPr>
+                          <w:id w:val="1077172812"/>
+                          <w:placeholder>
+                            <w:docPart w:val="30E7C6E2ABA64B02925472EFBF2CC354"/>
+                          </w:placeholder>
+                          <w15:appearance w15:val="hidden"/>
+                        </w:sdtPr>
+                        <w:sdtEndPr/>
+                        <w:sdtContent>
+                          <w:sdt>
+                            <w:sdtPr>
+                              <w:id w:val="1977478065"/>
+                              <w:placeholder>
+                                <w:docPart w:val="116E9011D5724F8A81087161BCD256E5"/>
+                              </w:placeholder>
+                              <w15:appearance w15:val="hidden"/>
+                            </w:sdtPr>
+                            <w:sdtEndPr/>
+                            <w:sdtContent>
+                              <w:r>
+                                <w:t>2</w:t>
+                              </w:r>
+                              <w:r>
+                                <w:t>[Date]</w:t>
+                              </w:r>
+                              <w:r>
+                                <w:t>7</w:t>
+                              </w:r>
+                              <w:r>
+                                <w:t>[Date]</w:t>
+                              </w:r>
+                            </w:sdtContent>
+                          </w:sdt>
+                        </w:sdtContent>
+                      </w:sdt>
+                    </w:sdtContent>
+                  </w:sdt>
+                </w:p>
+              </w:tc>
+              <w:tc>
+                <w:tcPr>
+                  <w:tcW w:w="1723" w:type="dxa"/>
+                </w:tcPr>
+                <w:p>
+                  <w:r>
+                    <w:t>V</w:t>
+                  </w:r>
+                  <w:r>
+                    <w:t>1.0</w:t>
+                  </w:r>
+                </w:p>
+              </w:tc>
+            </w:tr>
+          </w:tbl>
+          <w:p/>
+        </w:tc>
+      </w:tr>
+    </w:tbl>
     <w:p/>
     <w:p>
       <w:pPr>
-        <w:pStyle w:val="Stylesubheader"/>
+        <w:pStyle w:val="Titre1sansnumrotation"/>
       </w:pPr>
       <w:r>
-        <w:t xml:space="preserve">[Sous-titre ou description]</w:t>
+        <w:t xml:space="preserve">Note</w:t>
       </w:r>
     </w:p>
     <w:p/>
@@ -64,9 +841,8 @@
         <w:t xml:space="preserve">[Contenu de la section 2]</w:t>
       </w:r>
     </w:p>
-    <w:p/>
     <w:sectPr>
-      <w:footerReference w:type="default" r:id="rId14"/>
+      <w:footerReference w:type="default" r:id="rId23"/>
       <w:pgSz w:w="11906" w:h="16838"/>
       <w:pgMar w:top="993" w:right="1417" w:bottom="1417" w:left="1417" w:header="708" w:footer="410" w:gutter="0"/>
       <w:cols w:space="708"/>
@@ -97,13 +873,6 @@
       <w:r>
         <w:continuationSeparator/>
       </w:r>
-    </w:p>
-  </w:endnote>
-  <w:endnote w:type="continuationNotice" w:id="1">
-    <w:p>
-      <w:pPr>
-        <w:spacing w:after="0" w:line="240" w:lineRule="auto"/>
-      </w:pPr>
     </w:p>
   </w:endnote>
 </w:endnotes>
@@ -186,7 +955,7 @@
         </mc:Choice>
         <mc:Fallback>
           <w:pict>
-            <v:line w14:anchorId="043A6ECF" id="Connecteur droit 1" o:spid="_x0000_s1026" style="position:absolute;z-index:251658240;visibility:visible;mso-wrap-style:square;mso-wrap-distance-left:9pt;mso-wrap-distance-top:0;mso-wrap-distance-right:9pt;mso-wrap-distance-bottom:0;mso-position-horizontal:absolute;mso-position-horizontal-relative:text;mso-position-vertical:absolute;mso-position-vertical-relative:text" from=".4pt,-2.5pt" to="460.9pt,-2.5pt" o:gfxdata="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" strokecolor="#d8d8d8 [2732]" strokeweight=".25pt">
+            <v:line w14:anchorId="2B60ABCE" id="Connecteur droit 1" o:spid="_x0000_s1026" style="position:absolute;z-index:251658240;visibility:visible;mso-wrap-style:square;mso-wrap-distance-left:9pt;mso-wrap-distance-top:0;mso-wrap-distance-right:9pt;mso-wrap-distance-bottom:0;mso-position-horizontal:absolute;mso-position-horizontal-relative:text;mso-position-vertical:absolute;mso-position-vertical-relative:text" from=".4pt,-2.5pt" to="460.9pt,-2.5pt" o:gfxdata="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" strokecolor="#d8d8d8 [2732]" strokeweight=".25pt">
               <v:stroke joinstyle="miter"/>
             </v:line>
           </w:pict>
@@ -323,22 +1092,15 @@
       </w:r>
     </w:p>
   </w:footnote>
-  <w:footnote w:type="continuationNotice" w:id="1">
-    <w:p>
-      <w:pPr>
-        <w:spacing w:after="0" w:line="240" w:lineRule="auto"/>
-      </w:pPr>
-    </w:p>
-  </w:footnote>
 </w:footnotes>
 </file>
 
 <file path=word/numbering.xml><?xml version="1.0" encoding="utf-8"?>
 <w:numbering xmlns:wpc="http://schemas.microsoft.com/office/word/2010/wordprocessingCanvas" xmlns:cx="http://schemas.microsoft.com/office/drawing/2014/chartex" xmlns:cx1="http://schemas.microsoft.com/office/drawing/2015/9/8/chartex" xmlns:cx2="http://schemas.microsoft.com/office/drawing/2015/10/21/chartex" xmlns:cx3="http://schemas.microsoft.com/office/drawing/2016/5/9/chartex" xmlns:cx4="http://schemas.microsoft.com/office/drawing/2016/5/10/chartex" xmlns:cx5="http://schemas.microsoft.com/office/drawing/2016/5/11/chartex" xmlns:cx6="http://schemas.microsoft.com/office/drawing/2016/5/12/chartex" xmlns:cx7="http://schemas.microsoft.com/office/drawing/2016/5/13/chartex" xmlns:cx8="http://schemas.microsoft.com/office/drawing/2016/5/14/chartex" xmlns:mc="http://schemas.openxmlformats.org/markup-compatibility/2006" xmlns:aink="http://schemas.microsoft.com/office/drawing/2016/ink" xmlns:am3d="http://schemas.microsoft.com/office/drawing/2017/model3d" xmlns:o="urn:schemas-microsoft-com:office:office" xmlns:oel="http://schemas.microsoft.com/office/2019/extlst" xmlns:r="http://schemas.openxmlformats.org/officeDocument/2006/relationships" xmlns:m="http://schemas.openxmlformats.org/officeDocument/2006/math" xmlns:v="urn:schemas-microsoft-com:vml" xmlns:wp14="http://schemas.microsoft.com/office/word/2010/wordprocessingDrawing" xmlns:wp="http://schemas.openxmlformats.org/drawingml/2006/wordprocessingDrawing" xmlns:w10="urn:schemas-microsoft-com:office:word" xmlns:w="http://schemas.openxmlformats.org/wordprocessingml/2006/main" xmlns:w14="http://schemas.microsoft.com/office/word/2010/wordml" xmlns:w15="http://schemas.microsoft.com/office/word/2012/wordml" xmlns:w16cex="http://schemas.microsoft.com/office/word/2018/wordml/cex" xmlns:w16cid="http://schemas.microsoft.com/office/word/2016/wordml/cid" xmlns:w16="http://schemas.microsoft.com/office/word/2018/wordml" xmlns:w16du="http://schemas.microsoft.com/office/word/2023/wordml/word16du" xmlns:w16sdtdh="http://schemas.microsoft.com/office/word/2020/wordml/sdtdatahash" xmlns:w16sdtfl="http://schemas.microsoft.com/office/word/2024/wordml/sdtformatlock" xmlns:w16se="http://schemas.microsoft.com/office/word/2015/wordml/symex" xmlns:wpg="http://schemas.microsoft.com/office/word/2010/wordprocessingGroup" xmlns:wpi="http://schemas.microsoft.com/office/word/2010/wordprocessingInk" xmlns:wne="http://schemas.microsoft.com/office/word/2006/wordml" xmlns:wps="http://schemas.microsoft.com/office/word/2010/wordprocessingShape" mc:Ignorable="w14 w15 w16se w16cid w16 w16cex w16sdtdh w16sdtfl w16du wp14">
   <w:abstractNum w:abstractNumId="0" w15:restartNumberingAfterBreak="0">
-    <w:nsid w:val="08850162"/>
+    <w:nsid w:val="11104245"/>
     <w:multiLevelType w:val="multilevel"/>
-    <w:tmpl w:val="040C001F"/>
+    <w:tmpl w:val="0B981D8A"/>
     <w:lvl w:ilvl="0">
       <w:start w:val="1"/>
       <w:numFmt w:val="decimal"/>
@@ -351,6 +1113,7 @@
     <w:lvl w:ilvl="1">
       <w:start w:val="1"/>
       <w:numFmt w:val="decimal"/>
+      <w:pStyle w:val="Titre2"/>
       <w:lvlText w:val="%1.%2."/>
       <w:lvlJc w:val="left"/>
       <w:pPr>
@@ -422,12 +1185,13 @@
     </w:lvl>
   </w:abstractNum>
   <w:abstractNum w:abstractNumId="1" w15:restartNumberingAfterBreak="0">
-    <w:nsid w:val="11104245"/>
+    <w:nsid w:val="244A69CF"/>
     <w:multiLevelType w:val="multilevel"/>
-    <w:tmpl w:val="DA188056"/>
+    <w:tmpl w:val="09F2EA9A"/>
     <w:lvl w:ilvl="0">
       <w:start w:val="1"/>
       <w:numFmt w:val="decimal"/>
+      <w:pStyle w:val="Titre1"/>
       <w:lvlText w:val="%1."/>
       <w:lvlJc w:val="left"/>
       <w:pPr>
@@ -508,513 +1272,29 @@
     </w:lvl>
   </w:abstractNum>
   <w:abstractNum w:abstractNumId="2" w15:restartNumberingAfterBreak="0">
-    <w:nsid w:val="13C0676D"/>
-    <w:multiLevelType w:val="multilevel"/>
-    <w:tmpl w:val="250478DE"/>
-    <w:lvl w:ilvl="0">
+    <w:nsid w:val="290C6312"/>
+    <w:multiLevelType w:val="hybridMultilevel"/>
+    <w:tmpl w:val="EF540F50"/>
+    <w:lvl w:ilvl="0" w:tplc="040C0011">
       <w:start w:val="1"/>
       <w:numFmt w:val="decimal"/>
-      <w:lvlText w:val="%1."/>
-      <w:lvlJc w:val="left"/>
-      <w:pPr>
-        <w:ind w:left="360" w:hanging="360"/>
-      </w:pPr>
-    </w:lvl>
-    <w:lvl w:ilvl="1">
-      <w:start w:val="1"/>
-      <w:numFmt w:val="decimal"/>
-      <w:lvlText w:val="%1.%2."/>
-      <w:lvlJc w:val="left"/>
-      <w:pPr>
-        <w:ind w:left="792" w:hanging="432"/>
-      </w:pPr>
-    </w:lvl>
-    <w:lvl w:ilvl="2">
-      <w:start w:val="1"/>
-      <w:numFmt w:val="decimal"/>
-      <w:lvlText w:val="%1.%2.%3."/>
-      <w:lvlJc w:val="left"/>
-      <w:pPr>
-        <w:ind w:left="1224" w:hanging="504"/>
-      </w:pPr>
-    </w:lvl>
-    <w:lvl w:ilvl="3">
-      <w:start w:val="1"/>
-      <w:numFmt w:val="decimal"/>
-      <w:lvlText w:val="%1.%2.%3.%4."/>
-      <w:lvlJc w:val="left"/>
-      <w:pPr>
-        <w:ind w:left="1728" w:hanging="648"/>
-      </w:pPr>
-    </w:lvl>
-    <w:lvl w:ilvl="4">
-      <w:start w:val="1"/>
-      <w:numFmt w:val="decimal"/>
-      <w:lvlText w:val="%1.%2.%3.%4.%5."/>
-      <w:lvlJc w:val="left"/>
-      <w:pPr>
-        <w:ind w:left="2232" w:hanging="792"/>
-      </w:pPr>
-    </w:lvl>
-    <w:lvl w:ilvl="5">
-      <w:start w:val="1"/>
-      <w:numFmt w:val="decimal"/>
-      <w:lvlText w:val="%1.%2.%3.%4.%5.%6."/>
-      <w:lvlJc w:val="left"/>
-      <w:pPr>
-        <w:ind w:left="2736" w:hanging="936"/>
-      </w:pPr>
-    </w:lvl>
-    <w:lvl w:ilvl="6">
-      <w:start w:val="1"/>
-      <w:numFmt w:val="decimal"/>
-      <w:lvlText w:val="%1.%2.%3.%4.%5.%6.%7."/>
-      <w:lvlJc w:val="left"/>
-      <w:pPr>
-        <w:ind w:left="3240" w:hanging="1080"/>
-      </w:pPr>
-    </w:lvl>
-    <w:lvl w:ilvl="7">
-      <w:start w:val="1"/>
-      <w:numFmt w:val="decimal"/>
-      <w:lvlText w:val="%1.%2.%3.%4.%5.%6.%7.%8."/>
-      <w:lvlJc w:val="left"/>
-      <w:pPr>
-        <w:ind w:left="3744" w:hanging="1224"/>
-      </w:pPr>
-    </w:lvl>
-    <w:lvl w:ilvl="8">
-      <w:start w:val="1"/>
-      <w:numFmt w:val="decimal"/>
-      <w:lvlText w:val="%1.%2.%3.%4.%5.%6.%7.%8.%9."/>
-      <w:lvlJc w:val="left"/>
-      <w:pPr>
-        <w:ind w:left="4320" w:hanging="1440"/>
-      </w:pPr>
-    </w:lvl>
-  </w:abstractNum>
-  <w:abstractNum w:abstractNumId="3" w15:restartNumberingAfterBreak="0">
-    <w:nsid w:val="1B0A1643"/>
-    <w:multiLevelType w:val="hybridMultilevel"/>
-    <w:tmpl w:val="5EC0495E"/>
-    <w:lvl w:ilvl="0" w:tplc="040C0001">
-      <w:start w:val="1"/>
-      <w:numFmt w:val="bullet"/>
-      <w:lvlText w:val=""/>
+      <w:lvlText w:val="%1)"/>
       <w:lvlJc w:val="left"/>
       <w:pPr>
         <w:ind w:left="720" w:hanging="360"/>
       </w:pPr>
       <w:rPr>
-        <w:rFonts w:ascii="Symbol" w:hAnsi="Symbol" w:hint="default"/>
-      </w:rPr>
-    </w:lvl>
-    <w:lvl w:ilvl="1" w:tplc="040C0003" w:tentative="1">
-      <w:start w:val="1"/>
-      <w:numFmt w:val="bullet"/>
-      <w:lvlText w:val="o"/>
+        <w:rFonts w:hint="default"/>
+      </w:rPr>
+    </w:lvl>
+    <w:lvl w:ilvl="1" w:tplc="040C0019" w:tentative="1">
+      <w:start w:val="1"/>
+      <w:numFmt w:val="lowerLetter"/>
+      <w:lvlText w:val="%2."/>
       <w:lvlJc w:val="left"/>
       <w:pPr>
         <w:ind w:left="1440" w:hanging="360"/>
       </w:pPr>
-      <w:rPr>
-        <w:rFonts w:ascii="Courier New" w:hAnsi="Courier New" w:cs="Courier New" w:hint="default"/>
-      </w:rPr>
-    </w:lvl>
-    <w:lvl w:ilvl="2" w:tplc="040C0005" w:tentative="1">
-      <w:start w:val="1"/>
-      <w:numFmt w:val="bullet"/>
-      <w:lvlText w:val=""/>
-      <w:lvlJc w:val="left"/>
-      <w:pPr>
-        <w:ind w:left="2160" w:hanging="360"/>
-      </w:pPr>
-      <w:rPr>
-        <w:rFonts w:ascii="Wingdings" w:hAnsi="Wingdings" w:hint="default"/>
-      </w:rPr>
-    </w:lvl>
-    <w:lvl w:ilvl="3" w:tplc="040C0001" w:tentative="1">
-      <w:start w:val="1"/>
-      <w:numFmt w:val="bullet"/>
-      <w:lvlText w:val=""/>
-      <w:lvlJc w:val="left"/>
-      <w:pPr>
-        <w:ind w:left="2880" w:hanging="360"/>
-      </w:pPr>
-      <w:rPr>
-        <w:rFonts w:ascii="Symbol" w:hAnsi="Symbol" w:hint="default"/>
-      </w:rPr>
-    </w:lvl>
-    <w:lvl w:ilvl="4" w:tplc="040C0003" w:tentative="1">
-      <w:start w:val="1"/>
-      <w:numFmt w:val="bullet"/>
-      <w:lvlText w:val="o"/>
-      <w:lvlJc w:val="left"/>
-      <w:pPr>
-        <w:ind w:left="3600" w:hanging="360"/>
-      </w:pPr>
-      <w:rPr>
-        <w:rFonts w:ascii="Courier New" w:hAnsi="Courier New" w:cs="Courier New" w:hint="default"/>
-      </w:rPr>
-    </w:lvl>
-    <w:lvl w:ilvl="5" w:tplc="040C0005" w:tentative="1">
-      <w:start w:val="1"/>
-      <w:numFmt w:val="bullet"/>
-      <w:lvlText w:val=""/>
-      <w:lvlJc w:val="left"/>
-      <w:pPr>
-        <w:ind w:left="4320" w:hanging="360"/>
-      </w:pPr>
-      <w:rPr>
-        <w:rFonts w:ascii="Wingdings" w:hAnsi="Wingdings" w:hint="default"/>
-      </w:rPr>
-    </w:lvl>
-    <w:lvl w:ilvl="6" w:tplc="040C0001" w:tentative="1">
-      <w:start w:val="1"/>
-      <w:numFmt w:val="bullet"/>
-      <w:lvlText w:val=""/>
-      <w:lvlJc w:val="left"/>
-      <w:pPr>
-        <w:ind w:left="5040" w:hanging="360"/>
-      </w:pPr>
-      <w:rPr>
-        <w:rFonts w:ascii="Symbol" w:hAnsi="Symbol" w:hint="default"/>
-      </w:rPr>
-    </w:lvl>
-    <w:lvl w:ilvl="7" w:tplc="040C0003" w:tentative="1">
-      <w:start w:val="1"/>
-      <w:numFmt w:val="bullet"/>
-      <w:lvlText w:val="o"/>
-      <w:lvlJc w:val="left"/>
-      <w:pPr>
-        <w:ind w:left="5760" w:hanging="360"/>
-      </w:pPr>
-      <w:rPr>
-        <w:rFonts w:ascii="Courier New" w:hAnsi="Courier New" w:cs="Courier New" w:hint="default"/>
-      </w:rPr>
-    </w:lvl>
-    <w:lvl w:ilvl="8" w:tplc="040C0005" w:tentative="1">
-      <w:start w:val="1"/>
-      <w:numFmt w:val="bullet"/>
-      <w:lvlText w:val=""/>
-      <w:lvlJc w:val="left"/>
-      <w:pPr>
-        <w:ind w:left="6480" w:hanging="360"/>
-      </w:pPr>
-      <w:rPr>
-        <w:rFonts w:ascii="Wingdings" w:hAnsi="Wingdings" w:hint="default"/>
-      </w:rPr>
-    </w:lvl>
-  </w:abstractNum>
-  <w:abstractNum w:abstractNumId="4" w15:restartNumberingAfterBreak="0">
-    <w:nsid w:val="21847C0C"/>
-    <w:multiLevelType w:val="hybridMultilevel"/>
-    <w:tmpl w:val="6C1C0976"/>
-    <w:lvl w:ilvl="0" w:tplc="040C0001">
-      <w:start w:val="1"/>
-      <w:numFmt w:val="bullet"/>
-      <w:lvlText w:val=""/>
-      <w:lvlJc w:val="left"/>
-      <w:pPr>
-        <w:ind w:left="720" w:hanging="360"/>
-      </w:pPr>
-      <w:rPr>
-        <w:rFonts w:ascii="Symbol" w:hAnsi="Symbol" w:hint="default"/>
-      </w:rPr>
-    </w:lvl>
-    <w:lvl w:ilvl="1" w:tplc="040C0003" w:tentative="1">
-      <w:start w:val="1"/>
-      <w:numFmt w:val="bullet"/>
-      <w:lvlText w:val="o"/>
-      <w:lvlJc w:val="left"/>
-      <w:pPr>
-        <w:ind w:left="1440" w:hanging="360"/>
-      </w:pPr>
-      <w:rPr>
-        <w:rFonts w:ascii="Courier New" w:hAnsi="Courier New" w:cs="Courier New" w:hint="default"/>
-      </w:rPr>
-    </w:lvl>
-    <w:lvl w:ilvl="2" w:tplc="040C0005" w:tentative="1">
-      <w:start w:val="1"/>
-      <w:numFmt w:val="bullet"/>
-      <w:lvlText w:val=""/>
-      <w:lvlJc w:val="left"/>
-      <w:pPr>
-        <w:ind w:left="2160" w:hanging="360"/>
-      </w:pPr>
-      <w:rPr>
-        <w:rFonts w:ascii="Wingdings" w:hAnsi="Wingdings" w:hint="default"/>
-      </w:rPr>
-    </w:lvl>
-    <w:lvl w:ilvl="3" w:tplc="040C0001" w:tentative="1">
-      <w:start w:val="1"/>
-      <w:numFmt w:val="bullet"/>
-      <w:lvlText w:val=""/>
-      <w:lvlJc w:val="left"/>
-      <w:pPr>
-        <w:ind w:left="2880" w:hanging="360"/>
-      </w:pPr>
-      <w:rPr>
-        <w:rFonts w:ascii="Symbol" w:hAnsi="Symbol" w:hint="default"/>
-      </w:rPr>
-    </w:lvl>
-    <w:lvl w:ilvl="4" w:tplc="040C0003" w:tentative="1">
-      <w:start w:val="1"/>
-      <w:numFmt w:val="bullet"/>
-      <w:lvlText w:val="o"/>
-      <w:lvlJc w:val="left"/>
-      <w:pPr>
-        <w:ind w:left="3600" w:hanging="360"/>
-      </w:pPr>
-      <w:rPr>
-        <w:rFonts w:ascii="Courier New" w:hAnsi="Courier New" w:cs="Courier New" w:hint="default"/>
-      </w:rPr>
-    </w:lvl>
-    <w:lvl w:ilvl="5" w:tplc="040C0005" w:tentative="1">
-      <w:start w:val="1"/>
-      <w:numFmt w:val="bullet"/>
-      <w:lvlText w:val=""/>
-      <w:lvlJc w:val="left"/>
-      <w:pPr>
-        <w:ind w:left="4320" w:hanging="360"/>
-      </w:pPr>
-      <w:rPr>
-        <w:rFonts w:ascii="Wingdings" w:hAnsi="Wingdings" w:hint="default"/>
-      </w:rPr>
-    </w:lvl>
-    <w:lvl w:ilvl="6" w:tplc="040C0001" w:tentative="1">
-      <w:start w:val="1"/>
-      <w:numFmt w:val="bullet"/>
-      <w:lvlText w:val=""/>
-      <w:lvlJc w:val="left"/>
-      <w:pPr>
-        <w:ind w:left="5040" w:hanging="360"/>
-      </w:pPr>
-      <w:rPr>
-        <w:rFonts w:ascii="Symbol" w:hAnsi="Symbol" w:hint="default"/>
-      </w:rPr>
-    </w:lvl>
-    <w:lvl w:ilvl="7" w:tplc="040C0003" w:tentative="1">
-      <w:start w:val="1"/>
-      <w:numFmt w:val="bullet"/>
-      <w:lvlText w:val="o"/>
-      <w:lvlJc w:val="left"/>
-      <w:pPr>
-        <w:ind w:left="5760" w:hanging="360"/>
-      </w:pPr>
-      <w:rPr>
-        <w:rFonts w:ascii="Courier New" w:hAnsi="Courier New" w:cs="Courier New" w:hint="default"/>
-      </w:rPr>
-    </w:lvl>
-    <w:lvl w:ilvl="8" w:tplc="040C0005" w:tentative="1">
-      <w:start w:val="1"/>
-      <w:numFmt w:val="bullet"/>
-      <w:lvlText w:val=""/>
-      <w:lvlJc w:val="left"/>
-      <w:pPr>
-        <w:ind w:left="6480" w:hanging="360"/>
-      </w:pPr>
-      <w:rPr>
-        <w:rFonts w:ascii="Wingdings" w:hAnsi="Wingdings" w:hint="default"/>
-      </w:rPr>
-    </w:lvl>
-  </w:abstractNum>
-  <w:abstractNum w:abstractNumId="5" w15:restartNumberingAfterBreak="0">
-    <w:nsid w:val="244A69CF"/>
-    <w:multiLevelType w:val="multilevel"/>
-    <w:tmpl w:val="63B819B6"/>
-    <w:lvl w:ilvl="0">
-      <w:start w:val="1"/>
-      <w:numFmt w:val="decimal"/>
-      <w:lvlText w:val="%1."/>
-      <w:lvlJc w:val="left"/>
-      <w:pPr>
-        <w:ind w:left="360" w:hanging="360"/>
-      </w:pPr>
-    </w:lvl>
-    <w:lvl w:ilvl="1">
-      <w:start w:val="1"/>
-      <w:numFmt w:val="decimal"/>
-      <w:lvlText w:val="%1.%2."/>
-      <w:lvlJc w:val="left"/>
-      <w:pPr>
-        <w:ind w:left="792" w:hanging="432"/>
-      </w:pPr>
-    </w:lvl>
-    <w:lvl w:ilvl="2">
-      <w:start w:val="1"/>
-      <w:numFmt w:val="decimal"/>
-      <w:lvlText w:val="%1.%2.%3."/>
-      <w:lvlJc w:val="left"/>
-      <w:pPr>
-        <w:ind w:left="1224" w:hanging="504"/>
-      </w:pPr>
-    </w:lvl>
-    <w:lvl w:ilvl="3">
-      <w:start w:val="1"/>
-      <w:numFmt w:val="decimal"/>
-      <w:lvlText w:val="%1.%2.%3.%4."/>
-      <w:lvlJc w:val="left"/>
-      <w:pPr>
-        <w:ind w:left="1728" w:hanging="648"/>
-      </w:pPr>
-    </w:lvl>
-    <w:lvl w:ilvl="4">
-      <w:start w:val="1"/>
-      <w:numFmt w:val="decimal"/>
-      <w:lvlText w:val="%1.%2.%3.%4.%5."/>
-      <w:lvlJc w:val="left"/>
-      <w:pPr>
-        <w:ind w:left="2232" w:hanging="792"/>
-      </w:pPr>
-    </w:lvl>
-    <w:lvl w:ilvl="5">
-      <w:start w:val="1"/>
-      <w:numFmt w:val="decimal"/>
-      <w:lvlText w:val="%1.%2.%3.%4.%5.%6."/>
-      <w:lvlJc w:val="left"/>
-      <w:pPr>
-        <w:ind w:left="2736" w:hanging="936"/>
-      </w:pPr>
-    </w:lvl>
-    <w:lvl w:ilvl="6">
-      <w:start w:val="1"/>
-      <w:numFmt w:val="decimal"/>
-      <w:lvlText w:val="%1.%2.%3.%4.%5.%6.%7."/>
-      <w:lvlJc w:val="left"/>
-      <w:pPr>
-        <w:ind w:left="3240" w:hanging="1080"/>
-      </w:pPr>
-    </w:lvl>
-    <w:lvl w:ilvl="7">
-      <w:start w:val="1"/>
-      <w:numFmt w:val="decimal"/>
-      <w:lvlText w:val="%1.%2.%3.%4.%5.%6.%7.%8."/>
-      <w:lvlJc w:val="left"/>
-      <w:pPr>
-        <w:ind w:left="3744" w:hanging="1224"/>
-      </w:pPr>
-    </w:lvl>
-    <w:lvl w:ilvl="8">
-      <w:start w:val="1"/>
-      <w:numFmt w:val="decimal"/>
-      <w:lvlText w:val="%1.%2.%3.%4.%5.%6.%7.%8.%9."/>
-      <w:lvlJc w:val="left"/>
-      <w:pPr>
-        <w:ind w:left="4320" w:hanging="1440"/>
-      </w:pPr>
-    </w:lvl>
-  </w:abstractNum>
-  <w:abstractNum w:abstractNumId="6" w15:restartNumberingAfterBreak="0">
-    <w:nsid w:val="30F84A9C"/>
-    <w:multiLevelType w:val="multilevel"/>
-    <w:tmpl w:val="040C001F"/>
-    <w:lvl w:ilvl="0">
-      <w:start w:val="1"/>
-      <w:numFmt w:val="decimal"/>
-      <w:lvlText w:val="%1."/>
-      <w:lvlJc w:val="left"/>
-      <w:pPr>
-        <w:ind w:left="360" w:hanging="360"/>
-      </w:pPr>
-    </w:lvl>
-    <w:lvl w:ilvl="1">
-      <w:start w:val="1"/>
-      <w:numFmt w:val="decimal"/>
-      <w:lvlText w:val="%1.%2."/>
-      <w:lvlJc w:val="left"/>
-      <w:pPr>
-        <w:ind w:left="792" w:hanging="432"/>
-      </w:pPr>
-    </w:lvl>
-    <w:lvl w:ilvl="2">
-      <w:start w:val="1"/>
-      <w:numFmt w:val="decimal"/>
-      <w:lvlText w:val="%1.%2.%3."/>
-      <w:lvlJc w:val="left"/>
-      <w:pPr>
-        <w:ind w:left="1224" w:hanging="504"/>
-      </w:pPr>
-    </w:lvl>
-    <w:lvl w:ilvl="3">
-      <w:start w:val="1"/>
-      <w:numFmt w:val="decimal"/>
-      <w:lvlText w:val="%1.%2.%3.%4."/>
-      <w:lvlJc w:val="left"/>
-      <w:pPr>
-        <w:ind w:left="1728" w:hanging="648"/>
-      </w:pPr>
-    </w:lvl>
-    <w:lvl w:ilvl="4">
-      <w:start w:val="1"/>
-      <w:numFmt w:val="decimal"/>
-      <w:lvlText w:val="%1.%2.%3.%4.%5."/>
-      <w:lvlJc w:val="left"/>
-      <w:pPr>
-        <w:ind w:left="2232" w:hanging="792"/>
-      </w:pPr>
-    </w:lvl>
-    <w:lvl w:ilvl="5">
-      <w:start w:val="1"/>
-      <w:numFmt w:val="decimal"/>
-      <w:lvlText w:val="%1.%2.%3.%4.%5.%6."/>
-      <w:lvlJc w:val="left"/>
-      <w:pPr>
-        <w:ind w:left="2736" w:hanging="936"/>
-      </w:pPr>
-    </w:lvl>
-    <w:lvl w:ilvl="6">
-      <w:start w:val="1"/>
-      <w:numFmt w:val="decimal"/>
-      <w:lvlText w:val="%1.%2.%3.%4.%5.%6.%7."/>
-      <w:lvlJc w:val="left"/>
-      <w:pPr>
-        <w:ind w:left="3240" w:hanging="1080"/>
-      </w:pPr>
-    </w:lvl>
-    <w:lvl w:ilvl="7">
-      <w:start w:val="1"/>
-      <w:numFmt w:val="decimal"/>
-      <w:lvlText w:val="%1.%2.%3.%4.%5.%6.%7.%8."/>
-      <w:lvlJc w:val="left"/>
-      <w:pPr>
-        <w:ind w:left="3744" w:hanging="1224"/>
-      </w:pPr>
-    </w:lvl>
-    <w:lvl w:ilvl="8">
-      <w:start w:val="1"/>
-      <w:numFmt w:val="decimal"/>
-      <w:lvlText w:val="%1.%2.%3.%4.%5.%6.%7.%8.%9."/>
-      <w:lvlJc w:val="left"/>
-      <w:pPr>
-        <w:ind w:left="4320" w:hanging="1440"/>
-      </w:pPr>
-    </w:lvl>
-  </w:abstractNum>
-  <w:abstractNum w:abstractNumId="7" w15:restartNumberingAfterBreak="0">
-    <w:nsid w:val="33AD444D"/>
-    <w:multiLevelType w:val="hybridMultilevel"/>
-    <w:tmpl w:val="B5F27D9E"/>
-    <w:lvl w:ilvl="0" w:tplc="040C000F">
-      <w:start w:val="1"/>
-      <w:numFmt w:val="decimal"/>
-      <w:lvlText w:val="%1."/>
-      <w:lvlJc w:val="left"/>
-      <w:pPr>
-        <w:ind w:left="720" w:hanging="360"/>
-      </w:pPr>
-    </w:lvl>
-    <w:lvl w:ilvl="1" w:tplc="B75E05F8">
-      <w:start w:val="1"/>
-      <w:numFmt w:val="decimal"/>
-      <w:lvlText w:val="%2."/>
-      <w:lvlJc w:val="left"/>
-      <w:pPr>
-        <w:ind w:left="1440" w:hanging="360"/>
-      </w:pPr>
-      <w:rPr>
-        <w:rFonts w:hint="default"/>
-      </w:rPr>
     </w:lvl>
     <w:lvl w:ilvl="2" w:tplc="040C001B" w:tentative="1">
       <w:start w:val="1"/>
@@ -1080,24 +1360,22 @@
       </w:pPr>
     </w:lvl>
   </w:abstractNum>
-  <w:abstractNum w:abstractNumId="8" w15:restartNumberingAfterBreak="0">
-    <w:nsid w:val="39B17B32"/>
+  <w:abstractNum w:abstractNumId="3" w15:restartNumberingAfterBreak="0">
+    <w:nsid w:val="2CDB7E73"/>
     <w:multiLevelType w:val="hybridMultilevel"/>
-    <w:tmpl w:val="D5A81950"/>
-    <w:lvl w:ilvl="0" w:tplc="920A2364">
-      <w:start w:val="1"/>
+    <w:tmpl w:val="39D29CE8"/>
+    <w:lvl w:ilvl="0" w:tplc="55C85CA2">
       <w:numFmt w:val="bullet"/>
-      <w:pStyle w:val="Listepuces1"/>
-      <w:lvlText w:val=""/>
+      <w:lvlText w:val="-"/>
       <w:lvlJc w:val="left"/>
       <w:pPr>
         <w:ind w:left="720" w:hanging="360"/>
       </w:pPr>
       <w:rPr>
-        <w:rFonts w:ascii="Symbol" w:hAnsi="Symbol" w:hint="default"/>
-      </w:rPr>
-    </w:lvl>
-    <w:lvl w:ilvl="1" w:tplc="040C0003" w:tentative="1">
+        <w:rFonts w:ascii="Arial" w:eastAsiaTheme="minorHAnsi" w:hAnsi="Arial" w:cs="Arial" w:hint="default"/>
+      </w:rPr>
+    </w:lvl>
+    <w:lvl w:ilvl="1" w:tplc="040C0003">
       <w:start w:val="1"/>
       <w:numFmt w:val="bullet"/>
       <w:lvlText w:val="o"/>
@@ -1194,16 +1472,419 @@
       </w:rPr>
     </w:lvl>
   </w:abstractNum>
-  <w:abstractNum w:abstractNumId="9" w15:restartNumberingAfterBreak="0">
-    <w:nsid w:val="4A7A7834"/>
-    <w:multiLevelType w:val="multilevel"/>
-    <w:tmpl w:val="77A8E064"/>
-    <w:lvl w:ilvl="0">
+  <w:abstractNum w:abstractNumId="4" w15:restartNumberingAfterBreak="0">
+    <w:nsid w:val="2EDF5EEC"/>
+    <w:multiLevelType w:val="hybridMultilevel"/>
+    <w:tmpl w:val="0906A7B4"/>
+    <w:lvl w:ilvl="0" w:tplc="040C0011">
+      <w:start w:val="1"/>
+      <w:numFmt w:val="decimal"/>
+      <w:lvlText w:val="%1)"/>
+      <w:lvlJc w:val="left"/>
+      <w:pPr>
+        <w:ind w:left="720" w:hanging="360"/>
+      </w:pPr>
+      <w:rPr>
+        <w:rFonts w:hint="default"/>
+      </w:rPr>
+    </w:lvl>
+    <w:lvl w:ilvl="1" w:tplc="040C0019" w:tentative="1">
+      <w:start w:val="1"/>
+      <w:numFmt w:val="lowerLetter"/>
+      <w:lvlText w:val="%2."/>
+      <w:lvlJc w:val="left"/>
+      <w:pPr>
+        <w:ind w:left="1440" w:hanging="360"/>
+      </w:pPr>
+    </w:lvl>
+    <w:lvl w:ilvl="2" w:tplc="040C001B" w:tentative="1">
+      <w:start w:val="1"/>
+      <w:numFmt w:val="lowerRoman"/>
+      <w:lvlText w:val="%3."/>
+      <w:lvlJc w:val="right"/>
+      <w:pPr>
+        <w:ind w:left="2160" w:hanging="180"/>
+      </w:pPr>
+    </w:lvl>
+    <w:lvl w:ilvl="3" w:tplc="040C000F" w:tentative="1">
+      <w:start w:val="1"/>
+      <w:numFmt w:val="decimal"/>
+      <w:lvlText w:val="%4."/>
+      <w:lvlJc w:val="left"/>
+      <w:pPr>
+        <w:ind w:left="2880" w:hanging="360"/>
+      </w:pPr>
+    </w:lvl>
+    <w:lvl w:ilvl="4" w:tplc="040C0019" w:tentative="1">
+      <w:start w:val="1"/>
+      <w:numFmt w:val="lowerLetter"/>
+      <w:lvlText w:val="%5."/>
+      <w:lvlJc w:val="left"/>
+      <w:pPr>
+        <w:ind w:left="3600" w:hanging="360"/>
+      </w:pPr>
+    </w:lvl>
+    <w:lvl w:ilvl="5" w:tplc="040C001B" w:tentative="1">
+      <w:start w:val="1"/>
+      <w:numFmt w:val="lowerRoman"/>
+      <w:lvlText w:val="%6."/>
+      <w:lvlJc w:val="right"/>
+      <w:pPr>
+        <w:ind w:left="4320" w:hanging="180"/>
+      </w:pPr>
+    </w:lvl>
+    <w:lvl w:ilvl="6" w:tplc="040C000F" w:tentative="1">
+      <w:start w:val="1"/>
+      <w:numFmt w:val="decimal"/>
+      <w:lvlText w:val="%7."/>
+      <w:lvlJc w:val="left"/>
+      <w:pPr>
+        <w:ind w:left="5040" w:hanging="360"/>
+      </w:pPr>
+    </w:lvl>
+    <w:lvl w:ilvl="7" w:tplc="040C0019" w:tentative="1">
+      <w:start w:val="1"/>
+      <w:numFmt w:val="lowerLetter"/>
+      <w:lvlText w:val="%8."/>
+      <w:lvlJc w:val="left"/>
+      <w:pPr>
+        <w:ind w:left="5760" w:hanging="360"/>
+      </w:pPr>
+    </w:lvl>
+    <w:lvl w:ilvl="8" w:tplc="040C001B" w:tentative="1">
+      <w:start w:val="1"/>
+      <w:numFmt w:val="lowerRoman"/>
+      <w:lvlText w:val="%9."/>
+      <w:lvlJc w:val="right"/>
+      <w:pPr>
+        <w:ind w:left="6480" w:hanging="180"/>
+      </w:pPr>
+    </w:lvl>
+  </w:abstractNum>
+  <w:abstractNum w:abstractNumId="5" w15:restartNumberingAfterBreak="0">
+    <w:nsid w:val="34E73702"/>
+    <w:multiLevelType w:val="hybridMultilevel"/>
+    <w:tmpl w:val="0C8A576E"/>
+    <w:lvl w:ilvl="0" w:tplc="8A94DE0C">
+      <w:start w:val="4"/>
+      <w:numFmt w:val="bullet"/>
+      <w:lvlText w:val=""/>
+      <w:lvlJc w:val="left"/>
+      <w:pPr>
+        <w:ind w:left="720" w:hanging="360"/>
+      </w:pPr>
+      <w:rPr>
+        <w:rFonts w:ascii="Wingdings" w:eastAsiaTheme="minorHAnsi" w:hAnsi="Wingdings" w:cs="Arial" w:hint="default"/>
+      </w:rPr>
+    </w:lvl>
+    <w:lvl w:ilvl="1" w:tplc="040C0003" w:tentative="1">
+      <w:start w:val="1"/>
+      <w:numFmt w:val="bullet"/>
+      <w:lvlText w:val="o"/>
+      <w:lvlJc w:val="left"/>
+      <w:pPr>
+        <w:ind w:left="1440" w:hanging="360"/>
+      </w:pPr>
+      <w:rPr>
+        <w:rFonts w:ascii="Courier New" w:hAnsi="Courier New" w:cs="Courier New" w:hint="default"/>
+      </w:rPr>
+    </w:lvl>
+    <w:lvl w:ilvl="2" w:tplc="040C0005" w:tentative="1">
+      <w:start w:val="1"/>
+      <w:numFmt w:val="bullet"/>
+      <w:lvlText w:val=""/>
+      <w:lvlJc w:val="left"/>
+      <w:pPr>
+        <w:ind w:left="2160" w:hanging="360"/>
+      </w:pPr>
+      <w:rPr>
+        <w:rFonts w:ascii="Wingdings" w:hAnsi="Wingdings" w:hint="default"/>
+      </w:rPr>
+    </w:lvl>
+    <w:lvl w:ilvl="3" w:tplc="040C0001" w:tentative="1">
+      <w:start w:val="1"/>
+      <w:numFmt w:val="bullet"/>
+      <w:lvlText w:val=""/>
+      <w:lvlJc w:val="left"/>
+      <w:pPr>
+        <w:ind w:left="2880" w:hanging="360"/>
+      </w:pPr>
+      <w:rPr>
+        <w:rFonts w:ascii="Symbol" w:hAnsi="Symbol" w:hint="default"/>
+      </w:rPr>
+    </w:lvl>
+    <w:lvl w:ilvl="4" w:tplc="040C0003" w:tentative="1">
+      <w:start w:val="1"/>
+      <w:numFmt w:val="bullet"/>
+      <w:lvlText w:val="o"/>
+      <w:lvlJc w:val="left"/>
+      <w:pPr>
+        <w:ind w:left="3600" w:hanging="360"/>
+      </w:pPr>
+      <w:rPr>
+        <w:rFonts w:ascii="Courier New" w:hAnsi="Courier New" w:cs="Courier New" w:hint="default"/>
+      </w:rPr>
+    </w:lvl>
+    <w:lvl w:ilvl="5" w:tplc="040C0005" w:tentative="1">
+      <w:start w:val="1"/>
+      <w:numFmt w:val="bullet"/>
+      <w:lvlText w:val=""/>
+      <w:lvlJc w:val="left"/>
+      <w:pPr>
+        <w:ind w:left="4320" w:hanging="360"/>
+      </w:pPr>
+      <w:rPr>
+        <w:rFonts w:ascii="Wingdings" w:hAnsi="Wingdings" w:hint="default"/>
+      </w:rPr>
+    </w:lvl>
+    <w:lvl w:ilvl="6" w:tplc="040C0001" w:tentative="1">
+      <w:start w:val="1"/>
+      <w:numFmt w:val="bullet"/>
+      <w:lvlText w:val=""/>
+      <w:lvlJc w:val="left"/>
+      <w:pPr>
+        <w:ind w:left="5040" w:hanging="360"/>
+      </w:pPr>
+      <w:rPr>
+        <w:rFonts w:ascii="Symbol" w:hAnsi="Symbol" w:hint="default"/>
+      </w:rPr>
+    </w:lvl>
+    <w:lvl w:ilvl="7" w:tplc="040C0003" w:tentative="1">
+      <w:start w:val="1"/>
+      <w:numFmt w:val="bullet"/>
+      <w:lvlText w:val="o"/>
+      <w:lvlJc w:val="left"/>
+      <w:pPr>
+        <w:ind w:left="5760" w:hanging="360"/>
+      </w:pPr>
+      <w:rPr>
+        <w:rFonts w:ascii="Courier New" w:hAnsi="Courier New" w:cs="Courier New" w:hint="default"/>
+      </w:rPr>
+    </w:lvl>
+    <w:lvl w:ilvl="8" w:tplc="040C0005" w:tentative="1">
+      <w:start w:val="1"/>
+      <w:numFmt w:val="bullet"/>
+      <w:lvlText w:val=""/>
+      <w:lvlJc w:val="left"/>
+      <w:pPr>
+        <w:ind w:left="6480" w:hanging="360"/>
+      </w:pPr>
+      <w:rPr>
+        <w:rFonts w:ascii="Wingdings" w:hAnsi="Wingdings" w:hint="default"/>
+      </w:rPr>
+    </w:lvl>
+  </w:abstractNum>
+  <w:abstractNum w:abstractNumId="6" w15:restartNumberingAfterBreak="0">
+    <w:nsid w:val="3B601E12"/>
+    <w:multiLevelType w:val="hybridMultilevel"/>
+    <w:tmpl w:val="A762F82A"/>
+    <w:lvl w:ilvl="0" w:tplc="040C000F">
       <w:start w:val="1"/>
       <w:numFmt w:val="decimal"/>
       <w:lvlText w:val="%1."/>
       <w:lvlJc w:val="left"/>
       <w:pPr>
+        <w:ind w:left="720" w:hanging="360"/>
+      </w:pPr>
+      <w:rPr>
+        <w:rFonts w:hint="default"/>
+      </w:rPr>
+    </w:lvl>
+    <w:lvl w:ilvl="1" w:tplc="040C0019" w:tentative="1">
+      <w:start w:val="1"/>
+      <w:numFmt w:val="lowerLetter"/>
+      <w:lvlText w:val="%2."/>
+      <w:lvlJc w:val="left"/>
+      <w:pPr>
+        <w:ind w:left="1440" w:hanging="360"/>
+      </w:pPr>
+    </w:lvl>
+    <w:lvl w:ilvl="2" w:tplc="040C001B" w:tentative="1">
+      <w:start w:val="1"/>
+      <w:numFmt w:val="lowerRoman"/>
+      <w:lvlText w:val="%3."/>
+      <w:lvlJc w:val="right"/>
+      <w:pPr>
+        <w:ind w:left="2160" w:hanging="180"/>
+      </w:pPr>
+    </w:lvl>
+    <w:lvl w:ilvl="3" w:tplc="040C000F" w:tentative="1">
+      <w:start w:val="1"/>
+      <w:numFmt w:val="decimal"/>
+      <w:lvlText w:val="%4."/>
+      <w:lvlJc w:val="left"/>
+      <w:pPr>
+        <w:ind w:left="2880" w:hanging="360"/>
+      </w:pPr>
+    </w:lvl>
+    <w:lvl w:ilvl="4" w:tplc="040C0019" w:tentative="1">
+      <w:start w:val="1"/>
+      <w:numFmt w:val="lowerLetter"/>
+      <w:lvlText w:val="%5."/>
+      <w:lvlJc w:val="left"/>
+      <w:pPr>
+        <w:ind w:left="3600" w:hanging="360"/>
+      </w:pPr>
+    </w:lvl>
+    <w:lvl w:ilvl="5" w:tplc="040C001B" w:tentative="1">
+      <w:start w:val="1"/>
+      <w:numFmt w:val="lowerRoman"/>
+      <w:lvlText w:val="%6."/>
+      <w:lvlJc w:val="right"/>
+      <w:pPr>
+        <w:ind w:left="4320" w:hanging="180"/>
+      </w:pPr>
+    </w:lvl>
+    <w:lvl w:ilvl="6" w:tplc="040C000F" w:tentative="1">
+      <w:start w:val="1"/>
+      <w:numFmt w:val="decimal"/>
+      <w:lvlText w:val="%7."/>
+      <w:lvlJc w:val="left"/>
+      <w:pPr>
+        <w:ind w:left="5040" w:hanging="360"/>
+      </w:pPr>
+    </w:lvl>
+    <w:lvl w:ilvl="7" w:tplc="040C0019" w:tentative="1">
+      <w:start w:val="1"/>
+      <w:numFmt w:val="lowerLetter"/>
+      <w:lvlText w:val="%8."/>
+      <w:lvlJc w:val="left"/>
+      <w:pPr>
+        <w:ind w:left="5760" w:hanging="360"/>
+      </w:pPr>
+    </w:lvl>
+    <w:lvl w:ilvl="8" w:tplc="040C001B" w:tentative="1">
+      <w:start w:val="1"/>
+      <w:numFmt w:val="lowerRoman"/>
+      <w:lvlText w:val="%9."/>
+      <w:lvlJc w:val="right"/>
+      <w:pPr>
+        <w:ind w:left="6480" w:hanging="180"/>
+      </w:pPr>
+    </w:lvl>
+  </w:abstractNum>
+  <w:abstractNum w:abstractNumId="7" w15:restartNumberingAfterBreak="0">
+    <w:nsid w:val="46671A65"/>
+    <w:multiLevelType w:val="hybridMultilevel"/>
+    <w:tmpl w:val="703E6230"/>
+    <w:lvl w:ilvl="0" w:tplc="5010E694">
+      <w:numFmt w:val="bullet"/>
+      <w:lvlText w:val="-"/>
+      <w:lvlJc w:val="left"/>
+      <w:pPr>
+        <w:ind w:left="720" w:hanging="360"/>
+      </w:pPr>
+      <w:rPr>
+        <w:rFonts w:ascii="Arial" w:eastAsiaTheme="minorHAnsi" w:hAnsi="Arial" w:cs="Arial" w:hint="default"/>
+      </w:rPr>
+    </w:lvl>
+    <w:lvl w:ilvl="1" w:tplc="040C0003" w:tentative="1">
+      <w:start w:val="1"/>
+      <w:numFmt w:val="bullet"/>
+      <w:lvlText w:val="o"/>
+      <w:lvlJc w:val="left"/>
+      <w:pPr>
+        <w:ind w:left="1440" w:hanging="360"/>
+      </w:pPr>
+      <w:rPr>
+        <w:rFonts w:ascii="Courier New" w:hAnsi="Courier New" w:cs="Courier New" w:hint="default"/>
+      </w:rPr>
+    </w:lvl>
+    <w:lvl w:ilvl="2" w:tplc="040C0005" w:tentative="1">
+      <w:start w:val="1"/>
+      <w:numFmt w:val="bullet"/>
+      <w:lvlText w:val=""/>
+      <w:lvlJc w:val="left"/>
+      <w:pPr>
+        <w:ind w:left="2160" w:hanging="360"/>
+      </w:pPr>
+      <w:rPr>
+        <w:rFonts w:ascii="Wingdings" w:hAnsi="Wingdings" w:hint="default"/>
+      </w:rPr>
+    </w:lvl>
+    <w:lvl w:ilvl="3" w:tplc="040C0001" w:tentative="1">
+      <w:start w:val="1"/>
+      <w:numFmt w:val="bullet"/>
+      <w:lvlText w:val=""/>
+      <w:lvlJc w:val="left"/>
+      <w:pPr>
+        <w:ind w:left="2880" w:hanging="360"/>
+      </w:pPr>
+      <w:rPr>
+        <w:rFonts w:ascii="Symbol" w:hAnsi="Symbol" w:hint="default"/>
+      </w:rPr>
+    </w:lvl>
+    <w:lvl w:ilvl="4" w:tplc="040C0003" w:tentative="1">
+      <w:start w:val="1"/>
+      <w:numFmt w:val="bullet"/>
+      <w:lvlText w:val="o"/>
+      <w:lvlJc w:val="left"/>
+      <w:pPr>
+        <w:ind w:left="3600" w:hanging="360"/>
+      </w:pPr>
+      <w:rPr>
+        <w:rFonts w:ascii="Courier New" w:hAnsi="Courier New" w:cs="Courier New" w:hint="default"/>
+      </w:rPr>
+    </w:lvl>
+    <w:lvl w:ilvl="5" w:tplc="040C0005" w:tentative="1">
+      <w:start w:val="1"/>
+      <w:numFmt w:val="bullet"/>
+      <w:lvlText w:val=""/>
+      <w:lvlJc w:val="left"/>
+      <w:pPr>
+        <w:ind w:left="4320" w:hanging="360"/>
+      </w:pPr>
+      <w:rPr>
+        <w:rFonts w:ascii="Wingdings" w:hAnsi="Wingdings" w:hint="default"/>
+      </w:rPr>
+    </w:lvl>
+    <w:lvl w:ilvl="6" w:tplc="040C0001" w:tentative="1">
+      <w:start w:val="1"/>
+      <w:numFmt w:val="bullet"/>
+      <w:lvlText w:val=""/>
+      <w:lvlJc w:val="left"/>
+      <w:pPr>
+        <w:ind w:left="5040" w:hanging="360"/>
+      </w:pPr>
+      <w:rPr>
+        <w:rFonts w:ascii="Symbol" w:hAnsi="Symbol" w:hint="default"/>
+      </w:rPr>
+    </w:lvl>
+    <w:lvl w:ilvl="7" w:tplc="040C0003" w:tentative="1">
+      <w:start w:val="1"/>
+      <w:numFmt w:val="bullet"/>
+      <w:lvlText w:val="o"/>
+      <w:lvlJc w:val="left"/>
+      <w:pPr>
+        <w:ind w:left="5760" w:hanging="360"/>
+      </w:pPr>
+      <w:rPr>
+        <w:rFonts w:ascii="Courier New" w:hAnsi="Courier New" w:cs="Courier New" w:hint="default"/>
+      </w:rPr>
+    </w:lvl>
+    <w:lvl w:ilvl="8" w:tplc="040C0005" w:tentative="1">
+      <w:start w:val="1"/>
+      <w:numFmt w:val="bullet"/>
+      <w:lvlText w:val=""/>
+      <w:lvlJc w:val="left"/>
+      <w:pPr>
+        <w:ind w:left="6480" w:hanging="360"/>
+      </w:pPr>
+      <w:rPr>
+        <w:rFonts w:ascii="Wingdings" w:hAnsi="Wingdings" w:hint="default"/>
+      </w:rPr>
+    </w:lvl>
+  </w:abstractNum>
+  <w:abstractNum w:abstractNumId="8" w15:restartNumberingAfterBreak="0">
+    <w:nsid w:val="62885875"/>
+    <w:multiLevelType w:val="multilevel"/>
+    <w:tmpl w:val="F206624E"/>
+    <w:lvl w:ilvl="0">
+      <w:start w:val="1"/>
+      <w:numFmt w:val="decimal"/>
+      <w:lvlText w:val="%1."/>
+      <w:lvlJc w:val="left"/>
+      <w:pPr>
         <w:ind w:left="360" w:hanging="360"/>
       </w:pPr>
     </w:lvl>
@@ -1219,6 +1900,7 @@
     <w:lvl w:ilvl="2">
       <w:start w:val="1"/>
       <w:numFmt w:val="decimal"/>
+      <w:pStyle w:val="Titre3"/>
       <w:lvlText w:val="%1.%2.%3."/>
       <w:lvlJc w:val="left"/>
       <w:pPr>
@@ -1280,725 +1962,46 @@
       </w:pPr>
     </w:lvl>
   </w:abstractNum>
-  <w:abstractNum w:abstractNumId="10" w15:restartNumberingAfterBreak="0">
-    <w:nsid w:val="51CB2458"/>
-    <w:multiLevelType w:val="multilevel"/>
-    <w:tmpl w:val="040C001F"/>
-    <w:lvl w:ilvl="0">
-      <w:start w:val="1"/>
-      <w:numFmt w:val="decimal"/>
-      <w:lvlText w:val="%1."/>
-      <w:lvlJc w:val="left"/>
-      <w:pPr>
-        <w:ind w:left="360" w:hanging="360"/>
-      </w:pPr>
-    </w:lvl>
-    <w:lvl w:ilvl="1">
-      <w:start w:val="1"/>
-      <w:numFmt w:val="decimal"/>
-      <w:lvlText w:val="%1.%2."/>
-      <w:lvlJc w:val="left"/>
-      <w:pPr>
-        <w:ind w:left="792" w:hanging="432"/>
-      </w:pPr>
-    </w:lvl>
-    <w:lvl w:ilvl="2">
-      <w:start w:val="1"/>
-      <w:numFmt w:val="decimal"/>
-      <w:lvlText w:val="%1.%2.%3."/>
-      <w:lvlJc w:val="left"/>
-      <w:pPr>
-        <w:ind w:left="1224" w:hanging="504"/>
-      </w:pPr>
-    </w:lvl>
-    <w:lvl w:ilvl="3">
-      <w:start w:val="1"/>
-      <w:numFmt w:val="decimal"/>
-      <w:lvlText w:val="%1.%2.%3.%4."/>
-      <w:lvlJc w:val="left"/>
-      <w:pPr>
-        <w:ind w:left="1728" w:hanging="648"/>
-      </w:pPr>
-    </w:lvl>
-    <w:lvl w:ilvl="4">
-      <w:start w:val="1"/>
-      <w:numFmt w:val="decimal"/>
-      <w:lvlText w:val="%1.%2.%3.%4.%5."/>
-      <w:lvlJc w:val="left"/>
-      <w:pPr>
-        <w:ind w:left="2232" w:hanging="792"/>
-      </w:pPr>
-    </w:lvl>
-    <w:lvl w:ilvl="5">
-      <w:start w:val="1"/>
-      <w:numFmt w:val="decimal"/>
-      <w:lvlText w:val="%1.%2.%3.%4.%5.%6."/>
-      <w:lvlJc w:val="left"/>
-      <w:pPr>
-        <w:ind w:left="2736" w:hanging="936"/>
-      </w:pPr>
-    </w:lvl>
-    <w:lvl w:ilvl="6">
-      <w:start w:val="1"/>
-      <w:numFmt w:val="decimal"/>
-      <w:lvlText w:val="%1.%2.%3.%4.%5.%6.%7."/>
-      <w:lvlJc w:val="left"/>
-      <w:pPr>
-        <w:ind w:left="3240" w:hanging="1080"/>
-      </w:pPr>
-    </w:lvl>
-    <w:lvl w:ilvl="7">
-      <w:start w:val="1"/>
-      <w:numFmt w:val="decimal"/>
-      <w:lvlText w:val="%1.%2.%3.%4.%5.%6.%7.%8."/>
-      <w:lvlJc w:val="left"/>
-      <w:pPr>
-        <w:ind w:left="3744" w:hanging="1224"/>
-      </w:pPr>
-    </w:lvl>
-    <w:lvl w:ilvl="8">
-      <w:start w:val="1"/>
-      <w:numFmt w:val="decimal"/>
-      <w:lvlText w:val="%1.%2.%3.%4.%5.%6.%7.%8.%9."/>
-      <w:lvlJc w:val="left"/>
-      <w:pPr>
-        <w:ind w:left="4320" w:hanging="1440"/>
-      </w:pPr>
-    </w:lvl>
-  </w:abstractNum>
-  <w:abstractNum w:abstractNumId="11" w15:restartNumberingAfterBreak="0">
-    <w:nsid w:val="58452943"/>
-    <w:multiLevelType w:val="hybridMultilevel"/>
-    <w:tmpl w:val="68D4FA50"/>
-    <w:lvl w:ilvl="0" w:tplc="040C0001">
-      <w:start w:val="1"/>
-      <w:numFmt w:val="bullet"/>
-      <w:lvlText w:val=""/>
-      <w:lvlJc w:val="left"/>
-      <w:pPr>
-        <w:ind w:left="720" w:hanging="360"/>
-      </w:pPr>
-      <w:rPr>
-        <w:rFonts w:ascii="Symbol" w:hAnsi="Symbol" w:hint="default"/>
-      </w:rPr>
-    </w:lvl>
-    <w:lvl w:ilvl="1" w:tplc="040C0003" w:tentative="1">
-      <w:start w:val="1"/>
-      <w:numFmt w:val="bullet"/>
-      <w:lvlText w:val="o"/>
-      <w:lvlJc w:val="left"/>
-      <w:pPr>
-        <w:ind w:left="1440" w:hanging="360"/>
-      </w:pPr>
-      <w:rPr>
-        <w:rFonts w:ascii="Courier New" w:hAnsi="Courier New" w:cs="Courier New" w:hint="default"/>
-      </w:rPr>
-    </w:lvl>
-    <w:lvl w:ilvl="2" w:tplc="040C0005" w:tentative="1">
-      <w:start w:val="1"/>
-      <w:numFmt w:val="bullet"/>
-      <w:lvlText w:val=""/>
-      <w:lvlJc w:val="left"/>
-      <w:pPr>
-        <w:ind w:left="2160" w:hanging="360"/>
-      </w:pPr>
-      <w:rPr>
-        <w:rFonts w:ascii="Wingdings" w:hAnsi="Wingdings" w:hint="default"/>
-      </w:rPr>
-    </w:lvl>
-    <w:lvl w:ilvl="3" w:tplc="040C0001" w:tentative="1">
-      <w:start w:val="1"/>
-      <w:numFmt w:val="bullet"/>
-      <w:lvlText w:val=""/>
-      <w:lvlJc w:val="left"/>
-      <w:pPr>
-        <w:ind w:left="2880" w:hanging="360"/>
-      </w:pPr>
-      <w:rPr>
-        <w:rFonts w:ascii="Symbol" w:hAnsi="Symbol" w:hint="default"/>
-      </w:rPr>
-    </w:lvl>
-    <w:lvl w:ilvl="4" w:tplc="040C0003" w:tentative="1">
-      <w:start w:val="1"/>
-      <w:numFmt w:val="bullet"/>
-      <w:lvlText w:val="o"/>
-      <w:lvlJc w:val="left"/>
-      <w:pPr>
-        <w:ind w:left="3600" w:hanging="360"/>
-      </w:pPr>
-      <w:rPr>
-        <w:rFonts w:ascii="Courier New" w:hAnsi="Courier New" w:cs="Courier New" w:hint="default"/>
-      </w:rPr>
-    </w:lvl>
-    <w:lvl w:ilvl="5" w:tplc="040C0005" w:tentative="1">
-      <w:start w:val="1"/>
-      <w:numFmt w:val="bullet"/>
-      <w:lvlText w:val=""/>
-      <w:lvlJc w:val="left"/>
-      <w:pPr>
-        <w:ind w:left="4320" w:hanging="360"/>
-      </w:pPr>
-      <w:rPr>
-        <w:rFonts w:ascii="Wingdings" w:hAnsi="Wingdings" w:hint="default"/>
-      </w:rPr>
-    </w:lvl>
-    <w:lvl w:ilvl="6" w:tplc="040C0001" w:tentative="1">
-      <w:start w:val="1"/>
-      <w:numFmt w:val="bullet"/>
-      <w:lvlText w:val=""/>
-      <w:lvlJc w:val="left"/>
-      <w:pPr>
-        <w:ind w:left="5040" w:hanging="360"/>
-      </w:pPr>
-      <w:rPr>
-        <w:rFonts w:ascii="Symbol" w:hAnsi="Symbol" w:hint="default"/>
-      </w:rPr>
-    </w:lvl>
-    <w:lvl w:ilvl="7" w:tplc="040C0003" w:tentative="1">
-      <w:start w:val="1"/>
-      <w:numFmt w:val="bullet"/>
-      <w:lvlText w:val="o"/>
-      <w:lvlJc w:val="left"/>
-      <w:pPr>
-        <w:ind w:left="5760" w:hanging="360"/>
-      </w:pPr>
-      <w:rPr>
-        <w:rFonts w:ascii="Courier New" w:hAnsi="Courier New" w:cs="Courier New" w:hint="default"/>
-      </w:rPr>
-    </w:lvl>
-    <w:lvl w:ilvl="8" w:tplc="040C0005" w:tentative="1">
-      <w:start w:val="1"/>
-      <w:numFmt w:val="bullet"/>
-      <w:lvlText w:val=""/>
-      <w:lvlJc w:val="left"/>
-      <w:pPr>
-        <w:ind w:left="6480" w:hanging="360"/>
-      </w:pPr>
-      <w:rPr>
-        <w:rFonts w:ascii="Wingdings" w:hAnsi="Wingdings" w:hint="default"/>
-      </w:rPr>
-    </w:lvl>
-  </w:abstractNum>
-  <w:abstractNum w:abstractNumId="12" w15:restartNumberingAfterBreak="0">
-    <w:nsid w:val="62885875"/>
-    <w:multiLevelType w:val="multilevel"/>
-    <w:tmpl w:val="F254067C"/>
-    <w:lvl w:ilvl="0">
-      <w:start w:val="1"/>
-      <w:numFmt w:val="decimal"/>
-      <w:lvlText w:val="%1."/>
-      <w:lvlJc w:val="left"/>
-      <w:pPr>
-        <w:ind w:left="360" w:hanging="360"/>
-      </w:pPr>
-    </w:lvl>
-    <w:lvl w:ilvl="1">
-      <w:start w:val="1"/>
-      <w:numFmt w:val="decimal"/>
-      <w:lvlText w:val="%1.%2."/>
-      <w:lvlJc w:val="left"/>
-      <w:pPr>
-        <w:ind w:left="792" w:hanging="432"/>
-      </w:pPr>
-    </w:lvl>
-    <w:lvl w:ilvl="2">
-      <w:start w:val="1"/>
-      <w:numFmt w:val="decimal"/>
-      <w:lvlText w:val="%1.%2.%3."/>
-      <w:lvlJc w:val="left"/>
-      <w:pPr>
-        <w:ind w:left="1224" w:hanging="504"/>
-      </w:pPr>
-    </w:lvl>
-    <w:lvl w:ilvl="3">
-      <w:start w:val="1"/>
-      <w:numFmt w:val="decimal"/>
-      <w:lvlText w:val="%1.%2.%3.%4."/>
-      <w:lvlJc w:val="left"/>
-      <w:pPr>
-        <w:ind w:left="1728" w:hanging="648"/>
-      </w:pPr>
-    </w:lvl>
-    <w:lvl w:ilvl="4">
-      <w:start w:val="1"/>
-      <w:numFmt w:val="decimal"/>
-      <w:lvlText w:val="%1.%2.%3.%4.%5."/>
-      <w:lvlJc w:val="left"/>
-      <w:pPr>
-        <w:ind w:left="2232" w:hanging="792"/>
-      </w:pPr>
-    </w:lvl>
-    <w:lvl w:ilvl="5">
-      <w:start w:val="1"/>
-      <w:numFmt w:val="decimal"/>
-      <w:lvlText w:val="%1.%2.%3.%4.%5.%6."/>
-      <w:lvlJc w:val="left"/>
-      <w:pPr>
-        <w:ind w:left="2736" w:hanging="936"/>
-      </w:pPr>
-    </w:lvl>
-    <w:lvl w:ilvl="6">
-      <w:start w:val="1"/>
-      <w:numFmt w:val="decimal"/>
-      <w:lvlText w:val="%1.%2.%3.%4.%5.%6.%7."/>
-      <w:lvlJc w:val="left"/>
-      <w:pPr>
-        <w:ind w:left="3240" w:hanging="1080"/>
-      </w:pPr>
-    </w:lvl>
-    <w:lvl w:ilvl="7">
-      <w:start w:val="1"/>
-      <w:numFmt w:val="decimal"/>
-      <w:lvlText w:val="%1.%2.%3.%4.%5.%6.%7.%8."/>
-      <w:lvlJc w:val="left"/>
-      <w:pPr>
-        <w:ind w:left="3744" w:hanging="1224"/>
-      </w:pPr>
-    </w:lvl>
-    <w:lvl w:ilvl="8">
-      <w:start w:val="1"/>
-      <w:numFmt w:val="decimal"/>
-      <w:lvlText w:val="%1.%2.%3.%4.%5.%6.%7.%8.%9."/>
-      <w:lvlJc w:val="left"/>
-      <w:pPr>
-        <w:ind w:left="4320" w:hanging="1440"/>
-      </w:pPr>
-    </w:lvl>
-  </w:abstractNum>
-  <w:abstractNum w:abstractNumId="13" w15:restartNumberingAfterBreak="0">
-    <w:nsid w:val="6E021CB3"/>
-    <w:multiLevelType w:val="multilevel"/>
-    <w:tmpl w:val="040C001F"/>
-    <w:lvl w:ilvl="0">
-      <w:start w:val="1"/>
-      <w:numFmt w:val="decimal"/>
-      <w:lvlText w:val="%1."/>
-      <w:lvlJc w:val="left"/>
-      <w:pPr>
-        <w:ind w:left="360" w:hanging="360"/>
-      </w:pPr>
-    </w:lvl>
-    <w:lvl w:ilvl="1">
-      <w:start w:val="1"/>
-      <w:numFmt w:val="decimal"/>
-      <w:lvlText w:val="%1.%2."/>
-      <w:lvlJc w:val="left"/>
-      <w:pPr>
-        <w:ind w:left="792" w:hanging="432"/>
-      </w:pPr>
-    </w:lvl>
-    <w:lvl w:ilvl="2">
-      <w:start w:val="1"/>
-      <w:numFmt w:val="decimal"/>
-      <w:lvlText w:val="%1.%2.%3."/>
-      <w:lvlJc w:val="left"/>
-      <w:pPr>
-        <w:ind w:left="1224" w:hanging="504"/>
-      </w:pPr>
-    </w:lvl>
-    <w:lvl w:ilvl="3">
-      <w:start w:val="1"/>
-      <w:numFmt w:val="decimal"/>
-      <w:lvlText w:val="%1.%2.%3.%4."/>
-      <w:lvlJc w:val="left"/>
-      <w:pPr>
-        <w:ind w:left="1728" w:hanging="648"/>
-      </w:pPr>
-    </w:lvl>
-    <w:lvl w:ilvl="4">
-      <w:start w:val="1"/>
-      <w:numFmt w:val="decimal"/>
-      <w:lvlText w:val="%1.%2.%3.%4.%5."/>
-      <w:lvlJc w:val="left"/>
-      <w:pPr>
-        <w:ind w:left="2232" w:hanging="792"/>
-      </w:pPr>
-    </w:lvl>
-    <w:lvl w:ilvl="5">
-      <w:start w:val="1"/>
-      <w:numFmt w:val="decimal"/>
-      <w:lvlText w:val="%1.%2.%3.%4.%5.%6."/>
-      <w:lvlJc w:val="left"/>
-      <w:pPr>
-        <w:ind w:left="2736" w:hanging="936"/>
-      </w:pPr>
-    </w:lvl>
-    <w:lvl w:ilvl="6">
-      <w:start w:val="1"/>
-      <w:numFmt w:val="decimal"/>
-      <w:lvlText w:val="%1.%2.%3.%4.%5.%6.%7."/>
-      <w:lvlJc w:val="left"/>
-      <w:pPr>
-        <w:ind w:left="3240" w:hanging="1080"/>
-      </w:pPr>
-    </w:lvl>
-    <w:lvl w:ilvl="7">
-      <w:start w:val="1"/>
-      <w:numFmt w:val="decimal"/>
-      <w:lvlText w:val="%1.%2.%3.%4.%5.%6.%7.%8."/>
-      <w:lvlJc w:val="left"/>
-      <w:pPr>
-        <w:ind w:left="3744" w:hanging="1224"/>
-      </w:pPr>
-    </w:lvl>
-    <w:lvl w:ilvl="8">
-      <w:start w:val="1"/>
-      <w:numFmt w:val="decimal"/>
-      <w:lvlText w:val="%1.%2.%3.%4.%5.%6.%7.%8.%9."/>
-      <w:lvlJc w:val="left"/>
-      <w:pPr>
-        <w:ind w:left="4320" w:hanging="1440"/>
-      </w:pPr>
-    </w:lvl>
-  </w:abstractNum>
-  <w:abstractNum w:abstractNumId="14" w15:restartNumberingAfterBreak="0">
-    <w:nsid w:val="6EC4164B"/>
-    <w:multiLevelType w:val="multilevel"/>
-    <w:tmpl w:val="040C001F"/>
-    <w:lvl w:ilvl="0">
-      <w:start w:val="1"/>
-      <w:numFmt w:val="decimal"/>
-      <w:lvlText w:val="%1."/>
-      <w:lvlJc w:val="left"/>
-      <w:pPr>
-        <w:ind w:left="360" w:hanging="360"/>
-      </w:pPr>
-    </w:lvl>
-    <w:lvl w:ilvl="1">
-      <w:start w:val="1"/>
-      <w:numFmt w:val="decimal"/>
-      <w:lvlText w:val="%1.%2."/>
-      <w:lvlJc w:val="left"/>
-      <w:pPr>
-        <w:ind w:left="792" w:hanging="432"/>
-      </w:pPr>
-    </w:lvl>
-    <w:lvl w:ilvl="2">
-      <w:start w:val="1"/>
-      <w:numFmt w:val="decimal"/>
-      <w:lvlText w:val="%1.%2.%3."/>
-      <w:lvlJc w:val="left"/>
-      <w:pPr>
-        <w:ind w:left="1224" w:hanging="504"/>
-      </w:pPr>
-    </w:lvl>
-    <w:lvl w:ilvl="3">
-      <w:start w:val="1"/>
-      <w:numFmt w:val="decimal"/>
-      <w:lvlText w:val="%1.%2.%3.%4."/>
-      <w:lvlJc w:val="left"/>
-      <w:pPr>
-        <w:ind w:left="1728" w:hanging="648"/>
-      </w:pPr>
-    </w:lvl>
-    <w:lvl w:ilvl="4">
-      <w:start w:val="1"/>
-      <w:numFmt w:val="decimal"/>
-      <w:lvlText w:val="%1.%2.%3.%4.%5."/>
-      <w:lvlJc w:val="left"/>
-      <w:pPr>
-        <w:ind w:left="2232" w:hanging="792"/>
-      </w:pPr>
-    </w:lvl>
-    <w:lvl w:ilvl="5">
-      <w:start w:val="1"/>
-      <w:numFmt w:val="decimal"/>
-      <w:lvlText w:val="%1.%2.%3.%4.%5.%6."/>
-      <w:lvlJc w:val="left"/>
-      <w:pPr>
-        <w:ind w:left="2736" w:hanging="936"/>
-      </w:pPr>
-    </w:lvl>
-    <w:lvl w:ilvl="6">
-      <w:start w:val="1"/>
-      <w:numFmt w:val="decimal"/>
-      <w:lvlText w:val="%1.%2.%3.%4.%5.%6.%7."/>
-      <w:lvlJc w:val="left"/>
-      <w:pPr>
-        <w:ind w:left="3240" w:hanging="1080"/>
-      </w:pPr>
-    </w:lvl>
-    <w:lvl w:ilvl="7">
-      <w:start w:val="1"/>
-      <w:numFmt w:val="decimal"/>
-      <w:lvlText w:val="%1.%2.%3.%4.%5.%6.%7.%8."/>
-      <w:lvlJc w:val="left"/>
-      <w:pPr>
-        <w:ind w:left="3744" w:hanging="1224"/>
-      </w:pPr>
-    </w:lvl>
-    <w:lvl w:ilvl="8">
-      <w:start w:val="1"/>
-      <w:numFmt w:val="decimal"/>
-      <w:lvlText w:val="%1.%2.%3.%4.%5.%6.%7.%8.%9."/>
-      <w:lvlJc w:val="left"/>
-      <w:pPr>
-        <w:ind w:left="4320" w:hanging="1440"/>
-      </w:pPr>
-    </w:lvl>
-  </w:abstractNum>
-  <w:abstractNum w:abstractNumId="15" w15:restartNumberingAfterBreak="0">
-    <w:nsid w:val="7BF41D50"/>
-    <w:multiLevelType w:val="multilevel"/>
-    <w:tmpl w:val="15CC8D56"/>
-    <w:lvl w:ilvl="0">
-      <w:start w:val="1"/>
-      <w:numFmt w:val="decimal"/>
-      <w:lvlText w:val="%1."/>
-      <w:lvlJc w:val="left"/>
-      <w:pPr>
-        <w:ind w:left="360" w:hanging="360"/>
-      </w:pPr>
-    </w:lvl>
-    <w:lvl w:ilvl="1">
-      <w:start w:val="1"/>
-      <w:numFmt w:val="decimal"/>
-      <w:lvlText w:val="%1.%2."/>
-      <w:lvlJc w:val="left"/>
-      <w:pPr>
-        <w:ind w:left="792" w:hanging="432"/>
-      </w:pPr>
-    </w:lvl>
-    <w:lvl w:ilvl="2">
-      <w:start w:val="1"/>
-      <w:numFmt w:val="decimal"/>
-      <w:lvlText w:val="%1.%2.%3."/>
-      <w:lvlJc w:val="left"/>
-      <w:pPr>
-        <w:ind w:left="1224" w:hanging="504"/>
-      </w:pPr>
-    </w:lvl>
-    <w:lvl w:ilvl="3">
-      <w:start w:val="1"/>
-      <w:numFmt w:val="decimal"/>
-      <w:lvlText w:val="%1.%2.%3.%4."/>
-      <w:lvlJc w:val="left"/>
-      <w:pPr>
-        <w:ind w:left="1728" w:hanging="648"/>
-      </w:pPr>
-    </w:lvl>
-    <w:lvl w:ilvl="4">
-      <w:start w:val="1"/>
-      <w:numFmt w:val="decimal"/>
-      <w:lvlText w:val="%1.%2.%3.%4.%5."/>
-      <w:lvlJc w:val="left"/>
-      <w:pPr>
-        <w:ind w:left="2232" w:hanging="792"/>
-      </w:pPr>
-    </w:lvl>
-    <w:lvl w:ilvl="5">
-      <w:start w:val="1"/>
-      <w:numFmt w:val="decimal"/>
-      <w:lvlText w:val="%1.%2.%3.%4.%5.%6."/>
-      <w:lvlJc w:val="left"/>
-      <w:pPr>
-        <w:ind w:left="2736" w:hanging="936"/>
-      </w:pPr>
-    </w:lvl>
-    <w:lvl w:ilvl="6">
-      <w:start w:val="1"/>
-      <w:numFmt w:val="decimal"/>
-      <w:lvlText w:val="%1.%2.%3.%4.%5.%6.%7."/>
-      <w:lvlJc w:val="left"/>
-      <w:pPr>
-        <w:ind w:left="3240" w:hanging="1080"/>
-      </w:pPr>
-    </w:lvl>
-    <w:lvl w:ilvl="7">
-      <w:start w:val="1"/>
-      <w:numFmt w:val="decimal"/>
-      <w:lvlText w:val="%1.%2.%3.%4.%5.%6.%7.%8."/>
-      <w:lvlJc w:val="left"/>
-      <w:pPr>
-        <w:ind w:left="3744" w:hanging="1224"/>
-      </w:pPr>
-    </w:lvl>
-    <w:lvl w:ilvl="8">
-      <w:start w:val="1"/>
-      <w:numFmt w:val="decimal"/>
-      <w:lvlText w:val="%1.%2.%3.%4.%5.%6.%7.%8.%9."/>
-      <w:lvlJc w:val="left"/>
-      <w:pPr>
-        <w:ind w:left="4320" w:hanging="1440"/>
-      </w:pPr>
-    </w:lvl>
-  </w:abstractNum>
-  <w:abstractNum w:abstractNumId="16" w15:restartNumberingAfterBreak="0">
-    <w:nsid w:val="7D6C5CA3"/>
-    <w:multiLevelType w:val="multilevel"/>
-    <w:tmpl w:val="5DAAAB8C"/>
-    <w:lvl w:ilvl="0">
-      <w:start w:val="1"/>
-      <w:numFmt w:val="decimal"/>
-      <w:pStyle w:val="Titre1"/>
-      <w:lvlText w:val="%1."/>
-      <w:lvlJc w:val="left"/>
-      <w:pPr>
-        <w:ind w:left="360" w:hanging="360"/>
-      </w:pPr>
-      <w:rPr>
-        <w:rFonts w:hint="default"/>
-      </w:rPr>
-    </w:lvl>
-    <w:lvl w:ilvl="1">
-      <w:start w:val="1"/>
-      <w:numFmt w:val="decimal"/>
-      <w:pStyle w:val="Titre2"/>
-      <w:lvlText w:val="%1.%2"/>
-      <w:lvlJc w:val="left"/>
-      <w:pPr>
-        <w:ind w:left="720" w:hanging="360"/>
-      </w:pPr>
-      <w:rPr>
-        <w:rFonts w:hint="default"/>
-      </w:rPr>
-    </w:lvl>
-    <w:lvl w:ilvl="2">
-      <w:start w:val="1"/>
-      <w:numFmt w:val="decimal"/>
-      <w:pStyle w:val="Titre3"/>
-      <w:lvlText w:val="%1.%2.%3"/>
-      <w:lvlJc w:val="left"/>
-      <w:pPr>
-        <w:ind w:left="1080" w:hanging="360"/>
-      </w:pPr>
-      <w:rPr>
-        <w:rFonts w:hint="default"/>
-      </w:rPr>
-    </w:lvl>
-    <w:lvl w:ilvl="3">
-      <w:start w:val="1"/>
-      <w:numFmt w:val="decimal"/>
-      <w:lvlText w:val="(%4)"/>
-      <w:lvlJc w:val="left"/>
-      <w:pPr>
-        <w:ind w:left="1440" w:hanging="360"/>
-      </w:pPr>
-      <w:rPr>
-        <w:rFonts w:hint="default"/>
-      </w:rPr>
-    </w:lvl>
-    <w:lvl w:ilvl="4">
-      <w:start w:val="1"/>
-      <w:numFmt w:val="lowerLetter"/>
-      <w:lvlText w:val="(%5)"/>
-      <w:lvlJc w:val="left"/>
-      <w:pPr>
-        <w:ind w:left="1800" w:hanging="360"/>
-      </w:pPr>
-      <w:rPr>
-        <w:rFonts w:hint="default"/>
-      </w:rPr>
-    </w:lvl>
-    <w:lvl w:ilvl="5">
-      <w:start w:val="1"/>
-      <w:numFmt w:val="lowerRoman"/>
-      <w:lvlText w:val="(%6)"/>
-      <w:lvlJc w:val="left"/>
-      <w:pPr>
-        <w:ind w:left="2160" w:hanging="360"/>
-      </w:pPr>
-      <w:rPr>
-        <w:rFonts w:hint="default"/>
-      </w:rPr>
-    </w:lvl>
-    <w:lvl w:ilvl="6">
-      <w:start w:val="1"/>
-      <w:numFmt w:val="decimal"/>
-      <w:lvlText w:val="%7."/>
-      <w:lvlJc w:val="left"/>
-      <w:pPr>
-        <w:ind w:left="2520" w:hanging="360"/>
-      </w:pPr>
-      <w:rPr>
-        <w:rFonts w:hint="default"/>
-      </w:rPr>
-    </w:lvl>
-    <w:lvl w:ilvl="7">
-      <w:start w:val="1"/>
-      <w:numFmt w:val="lowerLetter"/>
-      <w:lvlText w:val="%8."/>
-      <w:lvlJc w:val="left"/>
-      <w:pPr>
-        <w:ind w:left="2880" w:hanging="360"/>
-      </w:pPr>
-      <w:rPr>
-        <w:rFonts w:hint="default"/>
-      </w:rPr>
-    </w:lvl>
-    <w:lvl w:ilvl="8">
-      <w:start w:val="1"/>
-      <w:numFmt w:val="lowerRoman"/>
-      <w:lvlText w:val="%9."/>
-      <w:lvlJc w:val="left"/>
-      <w:pPr>
-        <w:ind w:left="3240" w:hanging="360"/>
-      </w:pPr>
-      <w:rPr>
-        <w:rFonts w:hint="default"/>
-      </w:rPr>
-    </w:lvl>
-  </w:abstractNum>
-  <w:num w:numId="1" w16cid:durableId="912618277">
+  <w:num w:numId="1" w16cid:durableId="1497498160">
+    <w:abstractNumId w:val="1"/>
+  </w:num>
+  <w:num w:numId="2" w16cid:durableId="584388694">
+    <w:abstractNumId w:val="8"/>
+  </w:num>
+  <w:num w:numId="3" w16cid:durableId="1693602991">
+    <w:abstractNumId w:val="0"/>
+  </w:num>
+  <w:num w:numId="4" w16cid:durableId="1058169703">
+    <w:abstractNumId w:val="3"/>
+  </w:num>
+  <w:num w:numId="5" w16cid:durableId="875040860">
+    <w:abstractNumId w:val="6"/>
+  </w:num>
+  <w:num w:numId="6" w16cid:durableId="1501041706">
+    <w:abstractNumId w:val="5"/>
+  </w:num>
+  <w:num w:numId="7" w16cid:durableId="1363942749">
     <w:abstractNumId w:val="7"/>
   </w:num>
-  <w:num w:numId="2" w16cid:durableId="1538200225">
-    <w:abstractNumId w:val="13"/>
-  </w:num>
-  <w:num w:numId="3" w16cid:durableId="816534204">
-    <w:abstractNumId w:val="6"/>
-  </w:num>
-  <w:num w:numId="4" w16cid:durableId="1512643987">
-    <w:abstractNumId w:val="9"/>
-  </w:num>
-  <w:num w:numId="5" w16cid:durableId="856893124">
-    <w:abstractNumId w:val="14"/>
-  </w:num>
-  <w:num w:numId="6" w16cid:durableId="784035427">
-    <w:abstractNumId w:val="0"/>
-  </w:num>
-  <w:num w:numId="7" w16cid:durableId="1497498160">
-    <w:abstractNumId w:val="5"/>
-  </w:num>
-  <w:num w:numId="8" w16cid:durableId="189950677">
-    <w:abstractNumId w:val="10"/>
-  </w:num>
-  <w:num w:numId="9" w16cid:durableId="1560823523">
-    <w:abstractNumId w:val="5"/>
-  </w:num>
-  <w:num w:numId="10" w16cid:durableId="1535996705">
-    <w:abstractNumId w:val="15"/>
-  </w:num>
-  <w:num w:numId="11" w16cid:durableId="1055549517">
+  <w:num w:numId="8" w16cid:durableId="1790661446">
     <w:abstractNumId w:val="2"/>
   </w:num>
-  <w:num w:numId="12" w16cid:durableId="584388694">
-    <w:abstractNumId w:val="12"/>
+  <w:num w:numId="9" w16cid:durableId="2090956170">
+    <w:abstractNumId w:val="4"/>
   </w:num>
-  <w:num w:numId="13" w16cid:durableId="2004813045">
-    <w:abstractNumId w:val="2"/>
-  </w:num>
-  <w:num w:numId="14" w16cid:durableId="1284000786">
-    <w:abstractNumId w:val="2"/>
-  </w:num>
-  <w:num w:numId="15" w16cid:durableId="1693602991">
+  <w:num w:numId="10" w16cid:durableId="181941734">
     <w:abstractNumId w:val="1"/>
   </w:num>
-  <w:num w:numId="16" w16cid:durableId="2129546198">
-    <w:abstractNumId w:val="4"/>
+  <w:num w:numId="11" w16cid:durableId="2002467325">
+    <w:abstractNumId w:val="1"/>
   </w:num>
-  <w:num w:numId="17" w16cid:durableId="708607369">
-    <w:abstractNumId w:val="8"/>
+  <w:num w:numId="12" w16cid:durableId="1496263377">
+    <w:abstractNumId w:val="1"/>
   </w:num>
-  <w:num w:numId="18" w16cid:durableId="185949310">
-    <w:abstractNumId w:val="3"/>
+  <w:num w:numId="13" w16cid:durableId="394864106">
+    <w:abstractNumId w:val="1"/>
   </w:num>
-  <w:num w:numId="19" w16cid:durableId="851840770">
-    <w:abstractNumId w:val="16"/>
-  </w:num>
-  <w:num w:numId="20" w16cid:durableId="187721693">
-    <w:abstractNumId w:val="11"/>
-  </w:num>
+  <w:numIdMacAtCleanup w:val="9"/>
 </w:numbering>
 </file>
 
@@ -2402,7 +2405,7 @@
   <w:style w:type="paragraph" w:default="1" w:styleId="Normal">
     <w:name w:val="Normal"/>
     <w:qFormat/>
-    <w:rsid w:val="0005568C"/>
+    <w:rsid w:val="008457EE"/>
     <w:rPr>
       <w:rFonts w:ascii="Arial" w:hAnsi="Arial" w:cs="Arial"/>
       <w:sz w:val="20"/>
@@ -2411,19 +2414,19 @@
   </w:style>
   <w:style w:type="paragraph" w:styleId="Titre1">
     <w:name w:val="heading 1"/>
-    <w:aliases w:val="Heading 1"/>
+    <w:aliases w:val="Titre 1 numéroté"/>
     <w:basedOn w:val="Normal"/>
     <w:next w:val="Normal"/>
     <w:link w:val="Titre1Car"/>
     <w:autoRedefine/>
     <w:uiPriority w:val="9"/>
     <w:qFormat/>
-    <w:rsid w:val="007F3FAF"/>
+    <w:rsid w:val="00C77E6D"/>
     <w:pPr>
       <w:keepNext/>
       <w:keepLines/>
       <w:numPr>
-        <w:numId w:val="19"/>
+        <w:numId w:val="1"/>
       </w:numPr>
       <w:shd w:val="clear" w:color="auto" w:fill="DAE5EF" w:themeFill="accent2"/>
       <w:spacing w:before="480" w:after="200"/>
@@ -2442,7 +2445,7 @@
   </w:style>
   <w:style w:type="paragraph" w:styleId="Titre2">
     <w:name w:val="heading 2"/>
-    <w:aliases w:val="Heading 2"/>
+    <w:aliases w:val="Titre 2 numéroté"/>
     <w:basedOn w:val="Normal"/>
     <w:next w:val="Normal"/>
     <w:link w:val="Titre2Car"/>
@@ -2450,13 +2453,13 @@
     <w:uiPriority w:val="9"/>
     <w:unhideWhenUsed/>
     <w:qFormat/>
-    <w:rsid w:val="00DF01F4"/>
+    <w:rsid w:val="004852CE"/>
     <w:pPr>
       <w:keepNext/>
       <w:keepLines/>
       <w:numPr>
         <w:ilvl w:val="1"/>
-        <w:numId w:val="19"/>
+        <w:numId w:val="1"/>
       </w:numPr>
       <w:shd w:val="clear" w:color="auto" w:fill="EAF0F6"/>
       <w:tabs>
@@ -2474,7 +2477,7 @@
   </w:style>
   <w:style w:type="paragraph" w:styleId="Titre3">
     <w:name w:val="heading 3"/>
-    <w:aliases w:val="Heading 3"/>
+    <w:aliases w:val="Titre 3 numéroté"/>
     <w:basedOn w:val="Normal"/>
     <w:next w:val="Normal"/>
     <w:link w:val="Titre3Car"/>
@@ -2482,16 +2485,17 @@
     <w:uiPriority w:val="9"/>
     <w:unhideWhenUsed/>
     <w:qFormat/>
-    <w:rsid w:val="009603E8"/>
+    <w:rsid w:val="00D73364"/>
     <w:pPr>
       <w:keepNext/>
       <w:keepLines/>
       <w:numPr>
         <w:ilvl w:val="2"/>
-        <w:numId w:val="19"/>
+        <w:numId w:val="2"/>
       </w:numPr>
       <w:shd w:val="clear" w:color="auto" w:fill="F7F9FB"/>
       <w:spacing w:before="280" w:after="200"/>
+      <w:ind w:left="1560" w:hanging="840"/>
       <w:outlineLvl w:val="2"/>
     </w:pPr>
     <w:rPr>
@@ -2662,7 +2666,7 @@
   </w:style>
   <w:style w:type="character" w:customStyle="1" w:styleId="Titre1Car">
     <w:name w:val="Titre 1 Car"/>
-    <w:aliases w:val="Heading 1 Car"/>
+    <w:aliases w:val="Titre 1 numéroté Car"/>
     <w:basedOn w:val="Policepardfaut"/>
     <w:link w:val="Titre1"/>
     <w:uiPriority w:val="9"/>
@@ -2681,11 +2685,11 @@
   </w:style>
   <w:style w:type="character" w:customStyle="1" w:styleId="Titre2Car">
     <w:name w:val="Titre 2 Car"/>
-    <w:aliases w:val="Heading 2 Car"/>
+    <w:aliases w:val="Titre 2 numéroté Car"/>
     <w:basedOn w:val="Policepardfaut"/>
     <w:link w:val="Titre2"/>
     <w:uiPriority w:val="9"/>
-    <w:rsid w:val="00DF01F4"/>
+    <w:rsid w:val="004852CE"/>
     <w:rPr>
       <w:rFonts w:asciiTheme="majorHAnsi" w:eastAsiaTheme="majorEastAsia" w:hAnsiTheme="majorHAnsi" w:cstheme="majorBidi"/>
       <w:color w:val="233F70" w:themeColor="accent1" w:themeShade="BF"/>
@@ -2696,11 +2700,11 @@
   </w:style>
   <w:style w:type="character" w:customStyle="1" w:styleId="Titre3Car">
     <w:name w:val="Titre 3 Car"/>
-    <w:aliases w:val="Heading 3 Car"/>
+    <w:aliases w:val="Titre 3 numéroté Car"/>
     <w:basedOn w:val="Policepardfaut"/>
     <w:link w:val="Titre3"/>
     <w:uiPriority w:val="9"/>
-    <w:rsid w:val="009603E8"/>
+    <w:rsid w:val="00D73364"/>
     <w:rPr>
       <w:rFonts w:ascii="Arial" w:eastAsiaTheme="majorEastAsia" w:hAnsi="Arial" w:cstheme="majorBidi"/>
       <w:color w:val="233F70" w:themeColor="accent1" w:themeShade="BF"/>
@@ -2889,7 +2893,6 @@
   <w:style w:type="paragraph" w:styleId="Paragraphedeliste">
     <w:name w:val="List Paragraph"/>
     <w:basedOn w:val="Normal"/>
-    <w:link w:val="ParagraphedelisteCar"/>
     <w:uiPriority w:val="34"/>
     <w:qFormat/>
     <w:rsid w:val="000403AD"/>
@@ -3001,33 +3004,25 @@
   </w:style>
   <w:style w:type="paragraph" w:customStyle="1" w:styleId="Titre1sansnumrotation">
     <w:name w:val="Titre 1 sans numérotation"/>
-    <w:basedOn w:val="Normal"/>
-    <w:next w:val="Normal"/>
+    <w:basedOn w:val="Titre1"/>
     <w:link w:val="Titre1sansnumrotationCar"/>
     <w:autoRedefine/>
     <w:qFormat/>
-    <w:rsid w:val="00A74B3E"/>
+    <w:rsid w:val="00DF01F4"/>
     <w:pPr>
-      <w:shd w:val="clear" w:color="auto" w:fill="DAE5EF" w:themeFill="accent2"/>
+      <w:numPr>
+        <w:numId w:val="0"/>
+      </w:numPr>
       <w:ind w:firstLine="284"/>
     </w:pPr>
-    <w:rPr>
-      <w:b/>
-      <w:bCs/>
-      <w:smallCaps/>
-      <w:color w:val="233F70" w:themeColor="accent1" w:themeShade="BF"/>
-      <w:sz w:val="28"/>
-      <w:szCs w:val="28"/>
-      <w:lang w:val="en-GB"/>
-    </w:rPr>
   </w:style>
   <w:style w:type="character" w:customStyle="1" w:styleId="Titre1sansnumrotationCar">
     <w:name w:val="Titre 1 sans numérotation Car"/>
     <w:basedOn w:val="Titre1Car"/>
     <w:link w:val="Titre1sansnumrotation"/>
-    <w:rsid w:val="00A74B3E"/>
-    <w:rPr>
-      <w:rFonts w:ascii="Arial" w:eastAsiaTheme="majorEastAsia" w:hAnsi="Arial" w:cs="Arial"/>
+    <w:rsid w:val="00DF01F4"/>
+    <w:rPr>
+      <w:rFonts w:asciiTheme="majorHAnsi" w:eastAsiaTheme="majorEastAsia" w:hAnsiTheme="majorHAnsi" w:cstheme="majorBidi"/>
       <w:b/>
       <w:bCs/>
       <w:smallCaps/>
@@ -3036,7 +3031,6 @@
       <w:sz w:val="28"/>
       <w:szCs w:val="28"/>
       <w:shd w:val="clear" w:color="auto" w:fill="DAE5EF" w:themeFill="accent2"/>
-      <w:lang w:val="en-GB"/>
     </w:rPr>
   </w:style>
   <w:style w:type="paragraph" w:customStyle="1" w:styleId="Titre2sansnumrotation">
@@ -3087,7 +3081,7 @@
     <w:link w:val="Titre2sansnumCar"/>
     <w:autoRedefine/>
     <w:qFormat/>
-    <w:rsid w:val="00DF01F4"/>
+    <w:rsid w:val="00192C42"/>
     <w:pPr>
       <w:shd w:val="clear" w:color="auto" w:fill="EAF0F6"/>
       <w:tabs>
@@ -3106,7 +3100,7 @@
     <w:name w:val="Titre 2 sans num Car"/>
     <w:basedOn w:val="Titre2Car"/>
     <w:link w:val="Titre2sansnum"/>
-    <w:rsid w:val="00DF01F4"/>
+    <w:rsid w:val="00192C42"/>
     <w:rPr>
       <w:rFonts w:asciiTheme="majorHAnsi" w:eastAsiaTheme="majorEastAsia" w:hAnsiTheme="majorHAnsi" w:cstheme="majorHAnsi"/>
       <w:color w:val="233F70" w:themeColor="accent1" w:themeShade="BF"/>
@@ -3246,82 +3240,201 @@
       <w:szCs w:val="20"/>
     </w:rPr>
   </w:style>
-  <w:style w:type="paragraph" w:customStyle="1" w:styleId="Stylesubheader">
-    <w:name w:val="Style_subheader"/>
+  <w:style w:type="character" w:styleId="Mentionnonrsolue">
+    <w:name w:val="Unresolved Mention"/>
+    <w:basedOn w:val="Policepardfaut"/>
+    <w:uiPriority w:val="99"/>
+    <w:semiHidden/>
+    <w:unhideWhenUsed/>
+    <w:rsid w:val="001207E6"/>
+    <w:rPr>
+      <w:color w:val="605E5C"/>
+      <w:shd w:val="clear" w:color="auto" w:fill="E1DFDD"/>
+    </w:rPr>
+  </w:style>
+  <w:style w:type="paragraph" w:styleId="NormalWeb">
+    <w:name w:val="Normal (Web)"/>
     <w:basedOn w:val="Normal"/>
-    <w:link w:val="StylesubheaderCar"/>
-    <w:qFormat/>
-    <w:rsid w:val="00B345C3"/>
+    <w:uiPriority w:val="99"/>
+    <w:unhideWhenUsed/>
+    <w:rsid w:val="005B02D9"/>
     <w:pPr>
-      <w:shd w:val="clear" w:color="auto" w:fill="DAE5EF" w:themeFill="accent2"/>
-      <w:ind w:firstLine="284"/>
+      <w:spacing w:before="100" w:beforeAutospacing="1" w:after="100" w:afterAutospacing="1" w:line="240" w:lineRule="auto"/>
     </w:pPr>
     <w:rPr>
-      <w:b/>
-      <w:bCs/>
-      <w:shd w:val="clear" w:color="auto" w:fill="DAE5EF" w:themeFill="accent2"/>
-      <w:lang w:val="en-GB"/>
-    </w:rPr>
-  </w:style>
-  <w:style w:type="character" w:customStyle="1" w:styleId="StylesubheaderCar">
-    <w:name w:val="Style_subheader Car"/>
+      <w:rFonts w:ascii="Times New Roman" w:eastAsia="Times New Roman" w:hAnsi="Times New Roman" w:cs="Times New Roman"/>
+      <w:kern w:val="0"/>
+      <w:sz w:val="24"/>
+      <w:szCs w:val="24"/>
+      <w:lang w:eastAsia="fr-FR"/>
+      <w14:ligatures w14:val="none"/>
+    </w:rPr>
+  </w:style>
+  <w:style w:type="paragraph" w:styleId="PrformatHTML">
+    <w:name w:val="HTML Preformatted"/>
+    <w:basedOn w:val="Normal"/>
+    <w:link w:val="PrformatHTMLCar"/>
+    <w:uiPriority w:val="99"/>
+    <w:semiHidden/>
+    <w:unhideWhenUsed/>
+    <w:rsid w:val="005B02D9"/>
+    <w:pPr>
+      <w:tabs>
+        <w:tab w:val="left" w:pos="916"/>
+        <w:tab w:val="left" w:pos="1832"/>
+        <w:tab w:val="left" w:pos="2748"/>
+        <w:tab w:val="left" w:pos="3664"/>
+        <w:tab w:val="left" w:pos="4580"/>
+        <w:tab w:val="left" w:pos="5496"/>
+        <w:tab w:val="left" w:pos="6412"/>
+        <w:tab w:val="left" w:pos="7328"/>
+        <w:tab w:val="left" w:pos="8244"/>
+        <w:tab w:val="left" w:pos="9160"/>
+        <w:tab w:val="left" w:pos="10076"/>
+        <w:tab w:val="left" w:pos="10992"/>
+        <w:tab w:val="left" w:pos="11908"/>
+        <w:tab w:val="left" w:pos="12824"/>
+        <w:tab w:val="left" w:pos="13740"/>
+        <w:tab w:val="left" w:pos="14656"/>
+      </w:tabs>
+      <w:spacing w:after="0" w:line="240" w:lineRule="auto"/>
+    </w:pPr>
+    <w:rPr>
+      <w:rFonts w:ascii="Courier New" w:eastAsia="Times New Roman" w:hAnsi="Courier New" w:cs="Courier New"/>
+      <w:kern w:val="0"/>
+      <w:lang w:eastAsia="fr-FR"/>
+      <w14:ligatures w14:val="none"/>
+    </w:rPr>
+  </w:style>
+  <w:style w:type="character" w:customStyle="1" w:styleId="PrformatHTMLCar">
+    <w:name w:val="Préformaté HTML Car"/>
     <w:basedOn w:val="Policepardfaut"/>
-    <w:link w:val="Stylesubheader"/>
-    <w:rsid w:val="00B345C3"/>
-    <w:rPr>
-      <w:rFonts w:ascii="Arial" w:hAnsi="Arial" w:cs="Arial"/>
-      <w:b/>
-      <w:bCs/>
+    <w:link w:val="PrformatHTML"/>
+    <w:uiPriority w:val="99"/>
+    <w:semiHidden/>
+    <w:rsid w:val="005B02D9"/>
+    <w:rPr>
+      <w:rFonts w:ascii="Courier New" w:eastAsia="Times New Roman" w:hAnsi="Courier New" w:cs="Courier New"/>
+      <w:kern w:val="0"/>
       <w:sz w:val="20"/>
       <w:szCs w:val="20"/>
-      <w:shd w:val="clear" w:color="auto" w:fill="DAE5EF" w:themeFill="accent2"/>
-      <w:lang w:val="en-GB"/>
-    </w:rPr>
-  </w:style>
-  <w:style w:type="paragraph" w:customStyle="1" w:styleId="Listepuces1">
-    <w:name w:val="Liste à puces1"/>
-    <w:basedOn w:val="Paragraphedeliste"/>
-    <w:link w:val="ListBulletCar"/>
-    <w:autoRedefine/>
-    <w:qFormat/>
-    <w:rsid w:val="00FC5E29"/>
-    <w:pPr>
-      <w:numPr>
-        <w:numId w:val="17"/>
-      </w:numPr>
-    </w:pPr>
-    <w:rPr>
-      <w:lang w:val="en-GB"/>
-    </w:rPr>
-  </w:style>
-  <w:style w:type="character" w:customStyle="1" w:styleId="Listeapuces">
-    <w:name w:val="Liste_a_puces"/>
+      <w:lang w:eastAsia="fr-FR"/>
+      <w14:ligatures w14:val="none"/>
+    </w:rPr>
+  </w:style>
+  <w:style w:type="character" w:styleId="CodeHTML">
+    <w:name w:val="HTML Code"/>
     <w:basedOn w:val="Policepardfaut"/>
-    <w:uiPriority w:val="1"/>
-    <w:rsid w:val="009D41C2"/>
-  </w:style>
-  <w:style w:type="character" w:customStyle="1" w:styleId="ParagraphedelisteCar">
-    <w:name w:val="Paragraphe de liste Car"/>
-    <w:basedOn w:val="Policepardfaut"/>
-    <w:link w:val="Paragraphedeliste"/>
-    <w:uiPriority w:val="34"/>
-    <w:rsid w:val="00FC5E29"/>
-    <w:rPr>
-      <w:rFonts w:ascii="Arial" w:hAnsi="Arial" w:cs="Arial"/>
+    <w:uiPriority w:val="99"/>
+    <w:semiHidden/>
+    <w:unhideWhenUsed/>
+    <w:rsid w:val="005B02D9"/>
+    <w:rPr>
+      <w:rFonts w:ascii="Courier New" w:eastAsia="Times New Roman" w:hAnsi="Courier New" w:cs="Courier New"/>
       <w:sz w:val="20"/>
       <w:szCs w:val="20"/>
     </w:rPr>
   </w:style>
-  <w:style w:type="character" w:customStyle="1" w:styleId="ListBulletCar">
-    <w:name w:val="List Bullet Car"/>
-    <w:basedOn w:val="ParagraphedelisteCar"/>
-    <w:link w:val="Listepuces1"/>
-    <w:rsid w:val="00FC5E29"/>
-    <w:rPr>
-      <w:rFonts w:ascii="Arial" w:hAnsi="Arial" w:cs="Arial"/>
+  <w:style w:type="character" w:customStyle="1" w:styleId="hljs-builtin">
+    <w:name w:val="hljs-built_in"/>
+    <w:basedOn w:val="Policepardfaut"/>
+    <w:rsid w:val="005B02D9"/>
+  </w:style>
+  <w:style w:type="character" w:customStyle="1" w:styleId="hljs-string">
+    <w:name w:val="hljs-string"/>
+    <w:basedOn w:val="Policepardfaut"/>
+    <w:rsid w:val="005B02D9"/>
+  </w:style>
+  <w:style w:type="character" w:customStyle="1" w:styleId="hljs-subst">
+    <w:name w:val="hljs-subst"/>
+    <w:basedOn w:val="Policepardfaut"/>
+    <w:rsid w:val="005B02D9"/>
+  </w:style>
+  <w:style w:type="character" w:customStyle="1" w:styleId="hljs-variable">
+    <w:name w:val="hljs-variable"/>
+    <w:basedOn w:val="Policepardfaut"/>
+    <w:rsid w:val="005B02D9"/>
+  </w:style>
+  <w:style w:type="character" w:customStyle="1" w:styleId="hljs-attr">
+    <w:name w:val="hljs-attr"/>
+    <w:basedOn w:val="Policepardfaut"/>
+    <w:rsid w:val="00AB1478"/>
+  </w:style>
+  <w:style w:type="character" w:customStyle="1" w:styleId="hljs-number">
+    <w:name w:val="hljs-number"/>
+    <w:basedOn w:val="Policepardfaut"/>
+    <w:rsid w:val="00AB1478"/>
+  </w:style>
+  <w:style w:type="character" w:customStyle="1" w:styleId="hljs-literal">
+    <w:name w:val="hljs-literal"/>
+    <w:basedOn w:val="Policepardfaut"/>
+    <w:rsid w:val="00AB1478"/>
+  </w:style>
+  <w:style w:type="paragraph" w:customStyle="1" w:styleId="Code">
+    <w:name w:val="Code"/>
+    <w:basedOn w:val="Normal"/>
+    <w:link w:val="CodeCar"/>
+    <w:qFormat/>
+    <w:rsid w:val="00C12FE7"/>
+    <w:pPr>
+      <w:shd w:val="clear" w:color="auto" w:fill="2B2B2B"/>
+    </w:pPr>
+    <w:rPr>
+      <w:rFonts w:ascii="Courier New" w:hAnsi="Courier New" w:cs="Courier New"/>
+      <w:color w:val="F8F8F2"/>
+      <w:lang w:val="en-GB"/>
+    </w:rPr>
+  </w:style>
+  <w:style w:type="character" w:customStyle="1" w:styleId="CodeCar">
+    <w:name w:val="Code Car"/>
+    <w:basedOn w:val="Policepardfaut"/>
+    <w:link w:val="Code"/>
+    <w:rsid w:val="00C12FE7"/>
+    <w:rPr>
+      <w:rFonts w:ascii="Courier New" w:hAnsi="Courier New" w:cs="Courier New"/>
+      <w:color w:val="F8F8F2"/>
       <w:sz w:val="20"/>
       <w:szCs w:val="20"/>
+      <w:shd w:val="clear" w:color="auto" w:fill="2B2B2B"/>
       <w:lang w:val="en-GB"/>
+    </w:rPr>
+  </w:style>
+  <w:style w:type="paragraph" w:styleId="TM2">
+    <w:name w:val="toc 2"/>
+    <w:basedOn w:val="Normal"/>
+    <w:next w:val="Normal"/>
+    <w:autoRedefine/>
+    <w:uiPriority w:val="39"/>
+    <w:unhideWhenUsed/>
+    <w:rsid w:val="00AC08E1"/>
+    <w:pPr>
+      <w:spacing w:after="100"/>
+      <w:ind w:left="200"/>
+    </w:pPr>
+  </w:style>
+  <w:style w:type="paragraph" w:styleId="TM3">
+    <w:name w:val="toc 3"/>
+    <w:basedOn w:val="Normal"/>
+    <w:next w:val="Normal"/>
+    <w:autoRedefine/>
+    <w:uiPriority w:val="39"/>
+    <w:unhideWhenUsed/>
+    <w:rsid w:val="00AC08E1"/>
+    <w:pPr>
+      <w:spacing w:after="100"/>
+      <w:ind w:left="400"/>
+    </w:pPr>
+  </w:style>
+  <w:style w:type="character" w:styleId="Lienhypertextesuivivisit">
+    <w:name w:val="FollowedHyperlink"/>
+    <w:basedOn w:val="Policepardfaut"/>
+    <w:uiPriority w:val="99"/>
+    <w:semiHidden/>
+    <w:unhideWhenUsed/>
+    <w:rsid w:val="003C2C31"/>
+    <w:rPr>
+      <w:color w:val="954F72" w:themeColor="followedHyperlink"/>
+      <w:u w:val="single"/>
     </w:rPr>
   </w:style>
 </w:styles>
@@ -3526,6 +3639,44 @@
     </a:ext>
   </a:extLst>
 </a:theme>
+</file>
+
+<file path=word/webextensions/taskpanes.xml><?xml version="1.0" encoding="utf-8"?>
+<wetp:taskpanes xmlns:wetp="http://schemas.microsoft.com/office/webextensions/taskpanes/2010/11">
+  <wetp:taskpane dockstate="right" visibility="0" width="499" row="0">
+    <wetp:webextensionref xmlns:r="http://schemas.openxmlformats.org/officeDocument/2006/relationships" r:id="rId1"/>
+  </wetp:taskpane>
+  <wetp:taskpane dockstate="right" visibility="0" width="344" row="1">
+    <wetp:webextensionref xmlns:r="http://schemas.openxmlformats.org/officeDocument/2006/relationships" r:id="rId2"/>
+  </wetp:taskpane>
+</wetp:taskpanes>
+</file>
+
+<file path=word/webextensions/webextension1.xml><?xml version="1.0" encoding="utf-8"?>
+<we:webextension xmlns:we="http://schemas.microsoft.com/office/webextensions/webextension/2010/11" id="{4F0947D9-AF54-4B26-8007-F0EED6B21A36}">
+  <we:reference id="wa200000011" version="1.0.1.0" store="fr-FR" storeType="OMEX"/>
+  <we:alternateReferences>
+    <we:reference id="wa200000011" version="1.0.1.0" store="wa200000011" storeType="OMEX"/>
+  </we:alternateReferences>
+  <we:properties>
+    <we:property name="language" value="&quot;Bash&quot;"/>
+    <we:property name="theme" value="&quot;A11y Dark&quot;"/>
+  </we:properties>
+  <we:bindings/>
+  <we:snapshot xmlns:r="http://schemas.openxmlformats.org/officeDocument/2006/relationships"/>
+</we:webextension>
+</file>
+
+<file path=word/webextensions/webextension2.xml><?xml version="1.0" encoding="utf-8"?>
+<we:webextension xmlns:we="http://schemas.microsoft.com/office/webextensions/webextension/2010/11" id="{D2670199-D035-4BB0-9595-6EE463EB1410}">
+  <we:reference id="wa104382008" version="1.1.0.1" store="fr-FR" storeType="OMEX"/>
+  <we:alternateReferences>
+    <we:reference id="wa104382008" version="1.1.0.1" store="wa104382008" storeType="OMEX"/>
+  </we:alternateReferences>
+  <we:properties/>
+  <we:bindings/>
+  <we:snapshot xmlns:r="http://schemas.openxmlformats.org/officeDocument/2006/relationships"/>
+</we:webextension>
 </file>
 
 <file path=customXml/item1.xml><?xml version="1.0" encoding="utf-8"?>
@@ -3762,11 +3913,11 @@
 </file>
 
 <file path=customXml/itemProps2.xml><?xml version="1.0" encoding="utf-8"?>
-<ds:datastoreItem xmlns:ds="http://schemas.openxmlformats.org/officeDocument/2006/customXml" ds:itemID="{B4F040A9-E834-4664-AE39-9C74B15E5572}"/>
+<ds:datastoreItem xmlns:ds="http://schemas.openxmlformats.org/officeDocument/2006/customXml" ds:itemID="{DCCE2453-CCF4-4955-BC7A-AAC9E5CC085B}"/>
 </file>
 
 <file path=customXml/itemProps3.xml><?xml version="1.0" encoding="utf-8"?>
-<ds:datastoreItem xmlns:ds="http://schemas.openxmlformats.org/officeDocument/2006/customXml" ds:itemID="{7665ED32-6236-4E60-8581-2346C1FAA8AF}">
+<ds:datastoreItem xmlns:ds="http://schemas.openxmlformats.org/officeDocument/2006/customXml" ds:itemID="{63B1A128-F0C5-4F21-97ED-9B1DA012B2FB}">
   <ds:schemaRefs>
     <ds:schemaRef ds:uri="http://schemas.microsoft.com/office/2006/metadata/properties"/>
     <ds:schemaRef ds:uri="http://schemas.microsoft.com/office/infopath/2007/PartnerControls"/>
@@ -3777,7 +3928,7 @@
 </file>
 
 <file path=customXml/itemProps4.xml><?xml version="1.0" encoding="utf-8"?>
-<ds:datastoreItem xmlns:ds="http://schemas.openxmlformats.org/officeDocument/2006/customXml" ds:itemID="{2ED8B184-B23C-4FF3-93F6-6C228C1C2035}">
+<ds:datastoreItem xmlns:ds="http://schemas.openxmlformats.org/officeDocument/2006/customXml" ds:itemID="{46EBFF76-B606-467C-9A49-51F4FA4C9396}">
   <ds:schemaRefs>
     <ds:schemaRef ds:uri="http://schemas.microsoft.com/sharepoint/v3/contenttype/forms"/>
   </ds:schemaRefs>

</xml_diff>

<commit_message>
fix: pack.py syntax, remove trash file, add exact placeholders to instructions
- Fix pack.py argument syntax everywhere: positional args, not -o flag
- Remove [trash]/0000.dat from template-base.docx (caused validation failure)
- Consolidate fragmented date runs in version table
- Add exact placeholder reference tables for both templates
- Add rule: no XML comments in document content
- Add rule: insert content before </w:body>, not after tables

Generated with [Claude Code](https://claude.ai/code)
via [Happy](https://happy.engineering)

Co-Authored-By: Claude <noreply@anthropic.com>
Co-Authored-By: Happy <yesreply@happy.engineering>
</commit_message>
<xml_diff>
--- a/skills/docx/templates/onbehalfai/template-base.docx
+++ b/skills/docx/templates/onbehalfai/template-base.docx
@@ -474,7 +474,7 @@
                             <w:sdtContent>
                               <w:proofErr w:type="spellStart"/>
                               <w:r>
-                                <w:t>Statut</w:t>
+                                <w:t xml:space="preserve">[Date]</w:t>
                               </w:r>
                               <w:proofErr w:type="spellEnd"/>
                             </w:sdtContent>
@@ -526,7 +526,7 @@
                             <w:sdtEndPr/>
                             <w:sdtContent>
                               <w:r>
-                                <w:t>Auteur</w:t>
+                                <w:t/>
                               </w:r>
                             </w:sdtContent>
                           </w:sdt>
@@ -577,7 +577,7 @@
                             <w:sdtEndPr/>
                             <w:sdtContent>
                               <w:r>
-                                <w:t>Date</w:t>
+                                <w:t/>
                               </w:r>
                             </w:sdtContent>
                           </w:sdt>
@@ -593,7 +593,7 @@
                 </w:tcPr>
                 <w:p>
                   <w:r>
-                    <w:t>Version</w:t>
+                    <w:t/>
                   </w:r>
                 </w:p>
               </w:tc>
@@ -644,13 +644,13 @@
                                 <w:rPr>
                                   <w:lang w:val="fr-FR"/>
                                 </w:rPr>
-                                <w:t>Création</w:t>
+                                <w:t/>
                               </w:r>
                               <w:r>
                                 <w:rPr>
                                   <w:lang w:val="fr-FR"/>
                                 </w:rPr>
-                                <w:t xml:space="preserve"> </w:t>
+                                <w:t xml:space="preserve"/>
                               </w:r>
                             </w:sdtContent>
                           </w:sdt>
@@ -701,7 +701,7 @@
                             <w:sdtEndPr/>
                             <w:sdtContent>
                               <w:r>
-                                <w:t>[Auteur]</w:t>
+                                <w:t/>
                               </w:r>
                             </w:sdtContent>
                           </w:sdt>
@@ -752,16 +752,16 @@
                             <w:sdtEndPr/>
                             <w:sdtContent>
                               <w:r>
-                                <w:t>2</w:t>
+                                <w:t/>
                               </w:r>
                               <w:r>
-                                <w:t>[Date]</w:t>
+                                <w:t/>
                               </w:r>
                               <w:r>
-                                <w:t>7</w:t>
+                                <w:t/>
                               </w:r>
                               <w:r>
-                                <w:t>[Date]</w:t>
+                                <w:t/>
                               </w:r>
                             </w:sdtContent>
                           </w:sdt>
@@ -777,10 +777,10 @@
                 </w:tcPr>
                 <w:p>
                   <w:r>
-                    <w:t>V</w:t>
+                    <w:t/>
                   </w:r>
                   <w:r>
-                    <w:t>1.0</w:t>
+                    <w:t/>
                   </w:r>
                 </w:p>
               </w:tc>

</xml_diff>